<commit_message>
Avance 5: diagramas y más pantallas en el Word; P-073
Co-Authored-By: Claude Opus 5.5 <noreply@anthropic.com>
</commit_message>
<xml_diff>
--- a/docs/entregas/Avance 5 - Sprint 2 - Acopio.docx
+++ b/docs/entregas/Avance 5 - Sprint 2 - Acopio.docx
@@ -991,9 +991,610 @@
       </w:r>
     </w:p>
     <w:p>
-      <w:r>
-        <w:br w:type="page"/>
-      </w:r>
+      <w:pPr>
+        <w:pStyle w:val="Ttulo2"/>
+      </w:pPr>
+      <w:r>
+        <w:t>1c. Otras pantallas del incremento</w:t>
+      </w:r>
+    </w:p>
+    <w:p>
+      <w:r>
+        <w:t>El incremento tiene más pantallas que las de los dos flujos. Estas también leen la base de la demo del servidor.</w:t>
+      </w:r>
+    </w:p>
+    <w:p>
+      <w:pPr>
+        <w:keepNext/>
+        <w:spacing w:after="40"/>
+        <w:jc w:val="center"/>
+      </w:pPr>
+      <w:r>
+        <w:drawing>
+          <wp:inline xmlns:a="http://schemas.openxmlformats.org/drawingml/2006/main" xmlns:pic="http://schemas.openxmlformats.org/drawingml/2006/picture">
+            <wp:extent cx="1996208" cy="4319999"/>
+            <wp:docPr id="9" name="Picture 9"/>
+            <wp:cNvGraphicFramePr>
+              <a:graphicFrameLocks noChangeAspect="1"/>
+            </wp:cNvGraphicFramePr>
+            <a:graphic>
+              <a:graphicData uri="http://schemas.openxmlformats.org/drawingml/2006/picture">
+                <pic:pic>
+                  <pic:nvPicPr>
+                    <pic:cNvPr id="0" name="p05-mapa.png"/>
+                    <pic:cNvPicPr/>
+                  </pic:nvPicPr>
+                  <pic:blipFill>
+                    <a:blip r:embed="rId35"/>
+                    <a:stretch>
+                      <a:fillRect/>
+                    </a:stretch>
+                  </pic:blipFill>
+                  <pic:spPr>
+                    <a:xfrm>
+                      <a:off x="0" y="0"/>
+                      <a:ext cx="1996208" cy="4319999"/>
+                    </a:xfrm>
+                    <a:prstGeom prst="rect"/>
+                  </pic:spPr>
+                </pic:pic>
+              </a:graphicData>
+            </a:graphic>
+          </wp:inline>
+        </w:drawing>
+      </w:r>
+    </w:p>
+    <w:p>
+      <w:pPr>
+        <w:jc w:val="center"/>
+      </w:pPr>
+      <w:r>
+        <w:rPr>
+          <w:b/>
+          <w:color w:val="57534E"/>
+          <w:sz w:val="18"/>
+        </w:rPr>
+        <w:t xml:space="preserve">Figura 9. </w:t>
+      </w:r>
+      <w:r>
+        <w:rPr>
+          <w:color w:val="57534E"/>
+          <w:sz w:val="18"/>
+        </w:rPr>
+        <w:t>Mapa de acopios (P5): búsqueda por dirección, «Cerca de mí», filtros y mapa.</w:t>
+      </w:r>
+    </w:p>
+    <w:p>
+      <w:pPr>
+        <w:keepNext/>
+        <w:spacing w:after="40"/>
+        <w:jc w:val="center"/>
+      </w:pPr>
+      <w:r>
+        <w:drawing>
+          <wp:inline xmlns:a="http://schemas.openxmlformats.org/drawingml/2006/main" xmlns:pic="http://schemas.openxmlformats.org/drawingml/2006/picture">
+            <wp:extent cx="1996208" cy="4319999"/>
+            <wp:docPr id="10" name="Picture 10"/>
+            <wp:cNvGraphicFramePr>
+              <a:graphicFrameLocks noChangeAspect="1"/>
+            </wp:cNvGraphicFramePr>
+            <a:graphic>
+              <a:graphicData uri="http://schemas.openxmlformats.org/drawingml/2006/picture">
+                <pic:pic>
+                  <pic:nvPicPr>
+                    <pic:cNvPr id="0" name="p07-voluntariado.png"/>
+                    <pic:cNvPicPr/>
+                  </pic:nvPicPr>
+                  <pic:blipFill>
+                    <a:blip r:embed="rId36"/>
+                    <a:stretch>
+                      <a:fillRect/>
+                    </a:stretch>
+                  </pic:blipFill>
+                  <pic:spPr>
+                    <a:xfrm>
+                      <a:off x="0" y="0"/>
+                      <a:ext cx="1996208" cy="4319999"/>
+                    </a:xfrm>
+                    <a:prstGeom prst="rect"/>
+                  </pic:spPr>
+                </pic:pic>
+              </a:graphicData>
+            </a:graphic>
+          </wp:inline>
+        </w:drawing>
+      </w:r>
+    </w:p>
+    <w:p>
+      <w:pPr>
+        <w:jc w:val="center"/>
+      </w:pPr>
+      <w:r>
+        <w:rPr>
+          <w:b/>
+          <w:color w:val="57534E"/>
+          <w:sz w:val="18"/>
+        </w:rPr>
+        <w:t xml:space="preserve">Figura 10. </w:t>
+      </w:r>
+      <w:r>
+        <w:rPr>
+          <w:color w:val="57534E"/>
+          <w:sz w:val="18"/>
+        </w:rPr>
+        <w:t>Voluntariado (P7): jornadas por día con sus cupos reservados.</w:t>
+      </w:r>
+    </w:p>
+    <w:p>
+      <w:pPr>
+        <w:keepNext/>
+        <w:spacing w:after="40"/>
+        <w:jc w:val="center"/>
+      </w:pPr>
+      <w:r>
+        <w:drawing>
+          <wp:inline xmlns:a="http://schemas.openxmlformats.org/drawingml/2006/main" xmlns:pic="http://schemas.openxmlformats.org/drawingml/2006/picture">
+            <wp:extent cx="1996208" cy="4319999"/>
+            <wp:docPr id="11" name="Picture 11"/>
+            <wp:cNvGraphicFramePr>
+              <a:graphicFrameLocks noChangeAspect="1"/>
+            </wp:cNvGraphicFramePr>
+            <a:graphic>
+              <a:graphicData uri="http://schemas.openxmlformats.org/drawingml/2006/picture">
+                <pic:pic>
+                  <pic:nvPicPr>
+                    <pic:cNvPr id="0" name="c14-turnos.png"/>
+                    <pic:cNvPicPr/>
+                  </pic:nvPicPr>
+                  <pic:blipFill>
+                    <a:blip r:embed="rId37"/>
+                    <a:stretch>
+                      <a:fillRect/>
+                    </a:stretch>
+                  </pic:blipFill>
+                  <pic:spPr>
+                    <a:xfrm>
+                      <a:off x="0" y="0"/>
+                      <a:ext cx="1996208" cy="4319999"/>
+                    </a:xfrm>
+                    <a:prstGeom prst="rect"/>
+                  </pic:spPr>
+                </pic:pic>
+              </a:graphicData>
+            </a:graphic>
+          </wp:inline>
+        </w:drawing>
+      </w:r>
+    </w:p>
+    <w:p>
+      <w:pPr>
+        <w:jc w:val="center"/>
+      </w:pPr>
+      <w:r>
+        <w:rPr>
+          <w:b/>
+          <w:color w:val="57534E"/>
+          <w:sz w:val="18"/>
+        </w:rPr>
+        <w:t xml:space="preserve">Figura 11. </w:t>
+      </w:r>
+      <w:r>
+        <w:rPr>
+          <w:color w:val="57534E"/>
+          <w:sz w:val="18"/>
+        </w:rPr>
+        <w:t>Turnos en la consola (C14): jornadas próximas, en curso y pasadas, de acopios y de entidades.</w:t>
+      </w:r>
+    </w:p>
+    <w:p>
+      <w:pPr>
+        <w:sectPr>
+          <w:footerReference w:type="default" r:id="rId8"/>
+          <w:pgSz w:w="11906" w:h="16838"/>
+          <w:pgMar w:top="1247" w:right="1361" w:bottom="1134" w:left="1361" w:header="720" w:footer="720" w:gutter="0"/>
+          <w:cols w:space="720"/>
+          <w:docGrid w:linePitch="360"/>
+        </w:sectPr>
+      </w:pPr>
+    </w:p>
+    <w:p>
+      <w:pPr>
+        <w:pStyle w:val="Ttulo2"/>
+      </w:pPr>
+      <w:r>
+        <w:t>1d. Diagramas</w:t>
+      </w:r>
+    </w:p>
+    <w:p>
+      <w:r>
+        <w:t xml:space="preserve">Los diagramas están al día con el código del 18 de octubre. El de paquetes es el que pide la sustentación; se dibuja a mano en </w:t>
+      </w:r>
+      <w:r>
+        <w:rPr>
+          <w:rFonts w:ascii="Consolas" w:hAnsi="Consolas"/>
+          <w:sz w:val="19"/>
+        </w:rPr>
+        <w:t>docs/02-arquitectura/diagramas/paquetes.html</w:t>
+      </w:r>
+      <w:r>
+        <w:t xml:space="preserve"> y sus dependencias salen de dependency-cruiser. Los de contenedores y los modelos de datos se generan con Mermaid desde la misma carpeta.</w:t>
+      </w:r>
+    </w:p>
+    <w:p>
+      <w:pPr>
+        <w:keepNext/>
+        <w:spacing w:after="40"/>
+        <w:jc w:val="center"/>
+      </w:pPr>
+      <w:r>
+        <w:drawing>
+          <wp:inline xmlns:a="http://schemas.openxmlformats.org/drawingml/2006/main" xmlns:pic="http://schemas.openxmlformats.org/drawingml/2006/picture">
+            <wp:extent cx="8963660" cy="4132596"/>
+            <wp:docPr id="12" name="Picture 12"/>
+            <wp:cNvGraphicFramePr>
+              <a:graphicFrameLocks noChangeAspect="1"/>
+            </wp:cNvGraphicFramePr>
+            <a:graphic>
+              <a:graphicData uri="http://schemas.openxmlformats.org/drawingml/2006/picture">
+                <pic:pic>
+                  <pic:nvPicPr>
+                    <pic:cNvPr id="0" name="arquitectura-03-paquetes-del-monorepo.png"/>
+                    <pic:cNvPicPr/>
+                  </pic:nvPicPr>
+                  <pic:blipFill>
+                    <a:blip r:embed="rId38"/>
+                    <a:stretch>
+                      <a:fillRect/>
+                    </a:stretch>
+                  </pic:blipFill>
+                  <pic:spPr>
+                    <a:xfrm>
+                      <a:off x="0" y="0"/>
+                      <a:ext cx="8963660" cy="4132596"/>
+                    </a:xfrm>
+                    <a:prstGeom prst="rect"/>
+                  </pic:spPr>
+                </pic:pic>
+              </a:graphicData>
+            </a:graphic>
+          </wp:inline>
+        </w:drawing>
+      </w:r>
+    </w:p>
+    <w:p>
+      <w:pPr>
+        <w:jc w:val="center"/>
+      </w:pPr>
+      <w:r>
+        <w:rPr>
+          <w:b/>
+          <w:color w:val="57534E"/>
+          <w:sz w:val="18"/>
+        </w:rPr>
+        <w:t xml:space="preserve">Figura 12. </w:t>
+      </w:r>
+      <w:r>
+        <w:rPr>
+          <w:color w:val="57534E"/>
+          <w:sz w:val="18"/>
+        </w:rPr>
+        <w:t>Paquetes del monorepo: la web, la API y los paquetes compartidos.</w:t>
+      </w:r>
+    </w:p>
+    <w:p>
+      <w:pPr>
+        <w:keepNext/>
+        <w:spacing w:after="40"/>
+        <w:jc w:val="center"/>
+      </w:pPr>
+      <w:r>
+        <w:drawing>
+          <wp:inline xmlns:a="http://schemas.openxmlformats.org/drawingml/2006/main" xmlns:pic="http://schemas.openxmlformats.org/drawingml/2006/picture">
+            <wp:extent cx="6521442" cy="4896375"/>
+            <wp:docPr id="13" name="Picture 13"/>
+            <wp:cNvGraphicFramePr>
+              <a:graphicFrameLocks noChangeAspect="1"/>
+            </wp:cNvGraphicFramePr>
+            <a:graphic>
+              <a:graphicData uri="http://schemas.openxmlformats.org/drawingml/2006/picture">
+                <pic:pic>
+                  <pic:nvPicPr>
+                    <pic:cNvPr id="0" name="arquitectura-04-paquetes-de-la-api.png"/>
+                    <pic:cNvPicPr/>
+                  </pic:nvPicPr>
+                  <pic:blipFill>
+                    <a:blip r:embed="rId39"/>
+                    <a:stretch>
+                      <a:fillRect/>
+                    </a:stretch>
+                  </pic:blipFill>
+                  <pic:spPr>
+                    <a:xfrm>
+                      <a:off x="0" y="0"/>
+                      <a:ext cx="6521442" cy="4896375"/>
+                    </a:xfrm>
+                    <a:prstGeom prst="rect"/>
+                  </pic:spPr>
+                </pic:pic>
+              </a:graphicData>
+            </a:graphic>
+          </wp:inline>
+        </w:drawing>
+      </w:r>
+    </w:p>
+    <w:p>
+      <w:pPr>
+        <w:jc w:val="center"/>
+      </w:pPr>
+      <w:r>
+        <w:rPr>
+          <w:b/>
+          <w:color w:val="57534E"/>
+          <w:sz w:val="18"/>
+        </w:rPr>
+        <w:t xml:space="preserve">Figura 13. </w:t>
+      </w:r>
+      <w:r>
+        <w:rPr>
+          <w:color w:val="57534E"/>
+          <w:sz w:val="18"/>
+        </w:rPr>
+        <w:t>Paquetes de la API: los módulos de dominio arriba, los transversales abajo. Incluye turnos.</w:t>
+      </w:r>
+    </w:p>
+    <w:p>
+      <w:pPr>
+        <w:keepNext/>
+        <w:spacing w:after="40"/>
+        <w:jc w:val="center"/>
+      </w:pPr>
+      <w:r>
+        <w:drawing>
+          <wp:inline xmlns:a="http://schemas.openxmlformats.org/drawingml/2006/main" xmlns:pic="http://schemas.openxmlformats.org/drawingml/2006/picture">
+            <wp:extent cx="5575858" cy="4896375"/>
+            <wp:docPr id="14" name="Picture 14"/>
+            <wp:cNvGraphicFramePr>
+              <a:graphicFrameLocks noChangeAspect="1"/>
+            </wp:cNvGraphicFramePr>
+            <a:graphic>
+              <a:graphicData uri="http://schemas.openxmlformats.org/drawingml/2006/picture">
+                <pic:pic>
+                  <pic:nvPicPr>
+                    <pic:cNvPr id="0" name="arquitectura-02-contenedores.png"/>
+                    <pic:cNvPicPr/>
+                  </pic:nvPicPr>
+                  <pic:blipFill>
+                    <a:blip r:embed="rId40"/>
+                    <a:stretch>
+                      <a:fillRect/>
+                    </a:stretch>
+                  </pic:blipFill>
+                  <pic:spPr>
+                    <a:xfrm>
+                      <a:off x="0" y="0"/>
+                      <a:ext cx="5575858" cy="4896375"/>
+                    </a:xfrm>
+                    <a:prstGeom prst="rect"/>
+                  </pic:spPr>
+                </pic:pic>
+              </a:graphicData>
+            </a:graphic>
+          </wp:inline>
+        </w:drawing>
+      </w:r>
+    </w:p>
+    <w:p>
+      <w:pPr>
+        <w:jc w:val="center"/>
+      </w:pPr>
+      <w:r>
+        <w:rPr>
+          <w:b/>
+          <w:color w:val="57534E"/>
+          <w:sz w:val="18"/>
+        </w:rPr>
+        <w:t xml:space="preserve">Figura 14. </w:t>
+      </w:r>
+      <w:r>
+        <w:rPr>
+          <w:color w:val="57534E"/>
+          <w:sz w:val="18"/>
+        </w:rPr>
+        <w:t>Contenedores: el navegador, la web y la API en el VPS con Dokploy, y los servicios externos (Supabase Auth, SMTP, Nominatim, OpenStreetMap y RedAcopio).</w:t>
+      </w:r>
+    </w:p>
+    <w:p>
+      <w:pPr>
+        <w:keepNext/>
+        <w:spacing w:after="40"/>
+        <w:jc w:val="center"/>
+      </w:pPr>
+      <w:r>
+        <w:drawing>
+          <wp:inline xmlns:a="http://schemas.openxmlformats.org/drawingml/2006/main" xmlns:pic="http://schemas.openxmlformats.org/drawingml/2006/picture">
+            <wp:extent cx="8963660" cy="2336306"/>
+            <wp:docPr id="15" name="Picture 15"/>
+            <wp:cNvGraphicFramePr>
+              <a:graphicFrameLocks noChangeAspect="1"/>
+            </wp:cNvGraphicFramePr>
+            <a:graphic>
+              <a:graphicData uri="http://schemas.openxmlformats.org/drawingml/2006/picture">
+                <pic:pic>
+                  <pic:nvPicPr>
+                    <pic:cNvPr id="0" name="er-05-motor.png"/>
+                    <pic:cNvPicPr/>
+                  </pic:nvPicPr>
+                  <pic:blipFill>
+                    <a:blip r:embed="rId41"/>
+                    <a:stretch>
+                      <a:fillRect/>
+                    </a:stretch>
+                  </pic:blipFill>
+                  <pic:spPr>
+                    <a:xfrm>
+                      <a:off x="0" y="0"/>
+                      <a:ext cx="8963660" cy="2336306"/>
+                    </a:xfrm>
+                    <a:prstGeom prst="rect"/>
+                  </pic:spPr>
+                </pic:pic>
+              </a:graphicData>
+            </a:graphic>
+          </wp:inline>
+        </w:drawing>
+      </w:r>
+    </w:p>
+    <w:p>
+      <w:pPr>
+        <w:jc w:val="center"/>
+      </w:pPr>
+      <w:r>
+        <w:rPr>
+          <w:b/>
+          <w:color w:val="57534E"/>
+          <w:sz w:val="18"/>
+        </w:rPr>
+        <w:t xml:space="preserve">Figura 15. </w:t>
+      </w:r>
+      <w:r>
+        <w:rPr>
+          <w:color w:val="57534E"/>
+          <w:sz w:val="18"/>
+        </w:rPr>
+        <w:t>Modelo de datos del motor: sugerencias, remisiones con sus líneas y reportes de necesidad.</w:t>
+      </w:r>
+    </w:p>
+    <w:p>
+      <w:pPr>
+        <w:keepNext/>
+        <w:spacing w:after="40"/>
+        <w:jc w:val="center"/>
+      </w:pPr>
+      <w:r>
+        <w:drawing>
+          <wp:inline xmlns:a="http://schemas.openxmlformats.org/drawingml/2006/main" xmlns:pic="http://schemas.openxmlformats.org/drawingml/2006/picture">
+            <wp:extent cx="8963660" cy="4410971"/>
+            <wp:docPr id="16" name="Picture 16"/>
+            <wp:cNvGraphicFramePr>
+              <a:graphicFrameLocks noChangeAspect="1"/>
+            </wp:cNvGraphicFramePr>
+            <a:graphic>
+              <a:graphicData uri="http://schemas.openxmlformats.org/drawingml/2006/picture">
+                <pic:pic>
+                  <pic:nvPicPr>
+                    <pic:cNvPr id="0" name="er-02-red.png"/>
+                    <pic:cNvPicPr/>
+                  </pic:nvPicPr>
+                  <pic:blipFill>
+                    <a:blip r:embed="rId42"/>
+                    <a:stretch>
+                      <a:fillRect/>
+                    </a:stretch>
+                  </pic:blipFill>
+                  <pic:spPr>
+                    <a:xfrm>
+                      <a:off x="0" y="0"/>
+                      <a:ext cx="8963660" cy="4410971"/>
+                    </a:xfrm>
+                    <a:prstGeom prst="rect"/>
+                  </pic:spPr>
+                </pic:pic>
+              </a:graphicData>
+            </a:graphic>
+          </wp:inline>
+        </w:drawing>
+      </w:r>
+    </w:p>
+    <w:p>
+      <w:pPr>
+        <w:jc w:val="center"/>
+      </w:pPr>
+      <w:r>
+        <w:rPr>
+          <w:b/>
+          <w:color w:val="57534E"/>
+          <w:sz w:val="18"/>
+        </w:rPr>
+        <w:t xml:space="preserve">Figura 16. </w:t>
+      </w:r>
+      <w:r>
+        <w:rPr>
+          <w:color w:val="57534E"/>
+          <w:sz w:val="18"/>
+        </w:rPr>
+        <w:t>Modelo de datos de la red: emergencias, zonas, entidades, acopios y causas.</w:t>
+      </w:r>
+    </w:p>
+    <w:p>
+      <w:pPr>
+        <w:keepNext/>
+        <w:spacing w:after="40"/>
+        <w:jc w:val="center"/>
+      </w:pPr>
+      <w:r>
+        <w:drawing>
+          <wp:inline xmlns:a="http://schemas.openxmlformats.org/drawingml/2006/main" xmlns:pic="http://schemas.openxmlformats.org/drawingml/2006/picture">
+            <wp:extent cx="3664383" cy="4896374"/>
+            <wp:docPr id="17" name="Picture 17"/>
+            <wp:cNvGraphicFramePr>
+              <a:graphicFrameLocks noChangeAspect="1"/>
+            </wp:cNvGraphicFramePr>
+            <a:graphic>
+              <a:graphicData uri="http://schemas.openxmlformats.org/drawingml/2006/picture">
+                <pic:pic>
+                  <pic:nvPicPr>
+                    <pic:cNvPr id="0" name="er-06-turnos.png"/>
+                    <pic:cNvPicPr/>
+                  </pic:nvPicPr>
+                  <pic:blipFill>
+                    <a:blip r:embed="rId43"/>
+                    <a:stretch>
+                      <a:fillRect/>
+                    </a:stretch>
+                  </pic:blipFill>
+                  <pic:spPr>
+                    <a:xfrm>
+                      <a:off x="0" y="0"/>
+                      <a:ext cx="3664383" cy="4896374"/>
+                    </a:xfrm>
+                    <a:prstGeom prst="rect"/>
+                  </pic:spPr>
+                </pic:pic>
+              </a:graphicData>
+            </a:graphic>
+          </wp:inline>
+        </w:drawing>
+      </w:r>
+    </w:p>
+    <w:p>
+      <w:pPr>
+        <w:jc w:val="center"/>
+      </w:pPr>
+      <w:r>
+        <w:rPr>
+          <w:b/>
+          <w:color w:val="57534E"/>
+          <w:sz w:val="18"/>
+        </w:rPr>
+        <w:t xml:space="preserve">Figura 17. </w:t>
+      </w:r>
+      <w:r>
+        <w:rPr>
+          <w:color w:val="57534E"/>
+          <w:sz w:val="18"/>
+        </w:rPr>
+        <w:t>Modelo de datos de turnos: jornadas de acopio o de entidad y sus reservas.</w:t>
+      </w:r>
+    </w:p>
+    <w:p>
+      <w:pPr>
+        <w:sectPr>
+          <w:pgSz w:w="16838" w:h="11906" w:orient="landscape"/>
+          <w:pgMar w:top="1247" w:right="1361" w:bottom="1134" w:left="1361" w:header="720" w:footer="720" w:gutter="0"/>
+          <w:cols w:space="720"/>
+          <w:docGrid w:linePitch="360"/>
+        </w:sectPr>
+      </w:pPr>
     </w:p>
     <w:p>
       <w:pPr>
@@ -6382,7 +6983,6 @@
       </w:r>
     </w:p>
     <w:sectPr>
-      <w:footerReference w:type="default" r:id="rId8"/>
       <w:pgSz w:w="11906" w:h="16838"/>
       <w:pgMar w:top="1247" w:right="1361" w:bottom="1134" w:left="1361" w:header="720" w:footer="720" w:gutter="0"/>
       <w:cols w:space="720"/>

</xml_diff>

<commit_message>
Avance 5: galerías de capturas, retrospectiva y contenedor para renderizar el Word
Co-Authored-By: Claude Opus 5.5 <noreply@anthropic.com>
</commit_message>
<xml_diff>
--- a/docs/entregas/Avance 5 - Sprint 2 - Acopio.docx
+++ b/docs/entregas/Avance 5 - Sprint 2 - Acopio.docx
@@ -373,71 +373,10 @@
     </w:p>
     <w:p>
       <w:pPr>
-        <w:keepNext/>
-        <w:spacing w:after="40"/>
-        <w:jc w:val="center"/>
-      </w:pPr>
-      <w:r>
-        <w:drawing>
-          <wp:inline xmlns:a="http://schemas.openxmlformats.org/drawingml/2006/main" xmlns:pic="http://schemas.openxmlformats.org/drawingml/2006/picture">
-            <wp:extent cx="1996208" cy="4319999"/>
-            <wp:docPr id="1" name="Picture 1"/>
-            <wp:cNvGraphicFramePr>
-              <a:graphicFrameLocks noChangeAspect="1"/>
-            </wp:cNvGraphicFramePr>
-            <a:graphic>
-              <a:graphicData uri="http://schemas.openxmlformats.org/drawingml/2006/picture">
-                <pic:pic>
-                  <pic:nvPicPr>
-                    <pic:cNvPr id="0" name="c11-motor.png"/>
-                    <pic:cNvPicPr/>
-                  </pic:nvPicPr>
-                  <pic:blipFill>
-                    <a:blip r:embed="rId27"/>
-                    <a:stretch>
-                      <a:fillRect/>
-                    </a:stretch>
-                  </pic:blipFill>
-                  <pic:spPr>
-                    <a:xfrm>
-                      <a:off x="0" y="0"/>
-                      <a:ext cx="1996208" cy="4319999"/>
-                    </a:xfrm>
-                    <a:prstGeom prst="rect"/>
-                  </pic:spPr>
-                </pic:pic>
-              </a:graphicData>
-            </a:graphic>
-          </wp:inline>
-        </w:drawing>
-      </w:r>
-    </w:p>
-    <w:p>
-      <w:pPr>
-        <w:jc w:val="center"/>
-      </w:pPr>
-      <w:r>
-        <w:rPr>
-          <w:b/>
-          <w:color w:val="57534E"/>
-          <w:sz w:val="18"/>
-        </w:rPr>
-        <w:t xml:space="preserve">Figura 1. </w:t>
-      </w:r>
-      <w:r>
-        <w:rPr>
-          <w:color w:val="57534E"/>
-          <w:sz w:val="18"/>
-        </w:rPr>
-        <w:t>Motor de sugerencias (C11): traslados sugeridos con su puntaje.</w:t>
-      </w:r>
-    </w:p>
-    <w:p>
-      <w:pPr>
         <w:pStyle w:val="Vineta"/>
       </w:pPr>
       <w:r>
-        <w:t xml:space="preserve">1. </w:t>
+        <w:t xml:space="preserve">2. </w:t>
       </w:r>
       <w:r>
         <w:t xml:space="preserve">Un traslado aprobado se vuelve una </w:t>
@@ -454,71 +393,10 @@
     </w:p>
     <w:p>
       <w:pPr>
-        <w:keepNext/>
-        <w:spacing w:after="40"/>
-        <w:jc w:val="center"/>
-      </w:pPr>
-      <w:r>
-        <w:drawing>
-          <wp:inline xmlns:a="http://schemas.openxmlformats.org/drawingml/2006/main" xmlns:pic="http://schemas.openxmlformats.org/drawingml/2006/picture">
-            <wp:extent cx="1996208" cy="4319999"/>
-            <wp:docPr id="2" name="Picture 2"/>
-            <wp:cNvGraphicFramePr>
-              <a:graphicFrameLocks noChangeAspect="1"/>
-            </wp:cNvGraphicFramePr>
-            <a:graphic>
-              <a:graphicData uri="http://schemas.openxmlformats.org/drawingml/2006/picture">
-                <pic:pic>
-                  <pic:nvPicPr>
-                    <pic:cNvPr id="0" name="c12-remisiones.png"/>
-                    <pic:cNvPicPr/>
-                  </pic:nvPicPr>
-                  <pic:blipFill>
-                    <a:blip r:embed="rId28"/>
-                    <a:stretch>
-                      <a:fillRect/>
-                    </a:stretch>
-                  </pic:blipFill>
-                  <pic:spPr>
-                    <a:xfrm>
-                      <a:off x="0" y="0"/>
-                      <a:ext cx="1996208" cy="4319999"/>
-                    </a:xfrm>
-                    <a:prstGeom prst="rect"/>
-                  </pic:spPr>
-                </pic:pic>
-              </a:graphicData>
-            </a:graphic>
-          </wp:inline>
-        </w:drawing>
-      </w:r>
-    </w:p>
-    <w:p>
-      <w:pPr>
-        <w:jc w:val="center"/>
-      </w:pPr>
-      <w:r>
-        <w:rPr>
-          <w:b/>
-          <w:color w:val="57534E"/>
-          <w:sz w:val="18"/>
-        </w:rPr>
-        <w:t xml:space="preserve">Figura 2. </w:t>
-      </w:r>
-      <w:r>
-        <w:rPr>
-          <w:color w:val="57534E"/>
-          <w:sz w:val="18"/>
-        </w:rPr>
-        <w:t>Remisiones (C12): la remisión en borrador, lista para despachar.</w:t>
-      </w:r>
-    </w:p>
-    <w:p>
-      <w:pPr>
         <w:pStyle w:val="Vineta"/>
       </w:pPr>
       <w:r>
-        <w:t xml:space="preserve">1. </w:t>
+        <w:t xml:space="preserve">3. </w:t>
       </w:r>
       <w:r>
         <w:t xml:space="preserve">La remisión despachada tiene su </w:t>
@@ -535,141 +413,331 @@
     </w:p>
     <w:p>
       <w:pPr>
-        <w:keepNext/>
-        <w:spacing w:after="40"/>
-        <w:jc w:val="center"/>
-      </w:pPr>
-      <w:r>
-        <w:drawing>
-          <wp:inline xmlns:a="http://schemas.openxmlformats.org/drawingml/2006/main" xmlns:pic="http://schemas.openxmlformats.org/drawingml/2006/picture">
-            <wp:extent cx="1304697" cy="4319997"/>
-            <wp:docPr id="3" name="Picture 3"/>
-            <wp:cNvGraphicFramePr>
-              <a:graphicFrameLocks noChangeAspect="1"/>
-            </wp:cNvGraphicFramePr>
-            <a:graphic>
-              <a:graphicData uri="http://schemas.openxmlformats.org/drawingml/2006/picture">
-                <pic:pic>
-                  <pic:nvPicPr>
-                    <pic:cNvPr id="0" name="c12-documento.png"/>
-                    <pic:cNvPicPr/>
-                  </pic:nvPicPr>
-                  <pic:blipFill>
-                    <a:blip r:embed="rId29"/>
-                    <a:stretch>
-                      <a:fillRect/>
-                    </a:stretch>
-                  </pic:blipFill>
-                  <pic:spPr>
-                    <a:xfrm>
-                      <a:off x="0" y="0"/>
-                      <a:ext cx="1304697" cy="4319997"/>
-                    </a:xfrm>
-                    <a:prstGeom prst="rect"/>
-                  </pic:spPr>
-                </pic:pic>
-              </a:graphicData>
-            </a:graphic>
-          </wp:inline>
-        </w:drawing>
+        <w:pStyle w:val="Vineta"/>
+      </w:pPr>
+      <w:r>
+        <w:t xml:space="preserve">4. </w:t>
+      </w:r>
+      <w:r>
+        <w:t>En la zona, el Receptor escanea el QR o escribe el código, confirma lo que llegó y adjunta una foto. La pantalla confirma la recepción y lleva a la ficha de la zona. Si el código no es de una remisión, responde «Ese código no es el QR de una remisión»; si la remisión ya se recibió, «Esta remisión ya no está en camino a tus zonas».</w:t>
       </w:r>
     </w:p>
     <w:p>
-      <w:pPr>
+      <w:r>
+        <w:t>HU-13 Contar lo que la fórmula no ve se cubre desde «Mi zona»: el Receptor reporta una necesidad que el cálculo no conoce, y el motor la toma en cuenta al recalcular.</w:t>
+      </w:r>
+    </w:p>
+    <w:tbl>
+      <w:tblPr>
+        <w:tblW w:type="auto" w:w="0"/>
         <w:jc w:val="center"/>
-      </w:pPr>
-      <w:r>
-        <w:rPr>
-          <w:b/>
-          <w:color w:val="57534E"/>
-          <w:sz w:val="18"/>
-        </w:rPr>
-        <w:t xml:space="preserve">Figura 3. </w:t>
-      </w:r>
-      <w:r>
-        <w:rPr>
-          <w:color w:val="57534E"/>
-          <w:sz w:val="18"/>
-        </w:rPr>
-        <w:t>Documento de una remisión despachada, con su QR.</w:t>
-      </w:r>
+        <w:tblLook w:firstColumn="1" w:firstRow="1" w:lastColumn="0" w:lastRow="0" w:noHBand="0" w:noVBand="1" w:val="04A0"/>
+      </w:tblPr>
+      <w:tblGrid>
+        <w:gridCol w:w="3061"/>
+        <w:gridCol w:w="3061"/>
+        <w:gridCol w:w="3061"/>
+      </w:tblGrid>
+      <w:tr>
+        <w:trPr>
+          <w:cantSplit w:val="true"/>
+        </w:trPr>
+        <w:tc>
+          <w:tcPr>
+            <w:tcW w:type="dxa" w:w="3061"/>
+          </w:tcPr>
+          <w:p>
+            <w:pPr>
+              <w:jc w:val="center"/>
+            </w:pPr>
+            <w:r>
+              <w:drawing>
+                <wp:inline xmlns:a="http://schemas.openxmlformats.org/drawingml/2006/main" xmlns:pic="http://schemas.openxmlformats.org/drawingml/2006/picture">
+                  <wp:extent cx="1655946" cy="3583637"/>
+                  <wp:docPr id="1" name="Picture 1"/>
+                  <wp:cNvGraphicFramePr>
+                    <a:graphicFrameLocks noChangeAspect="1"/>
+                  </wp:cNvGraphicFramePr>
+                  <a:graphic>
+                    <a:graphicData uri="http://schemas.openxmlformats.org/drawingml/2006/picture">
+                      <pic:pic>
+                        <pic:nvPicPr>
+                          <pic:cNvPr id="0" name="c11-motor.png"/>
+                          <pic:cNvPicPr/>
+                        </pic:nvPicPr>
+                        <pic:blipFill>
+                          <a:blip r:embed="rId27"/>
+                          <a:stretch>
+                            <a:fillRect/>
+                          </a:stretch>
+                        </pic:blipFill>
+                        <pic:spPr>
+                          <a:xfrm>
+                            <a:off x="0" y="0"/>
+                            <a:ext cx="1655946" cy="3583637"/>
+                          </a:xfrm>
+                          <a:prstGeom prst="rect"/>
+                        </pic:spPr>
+                      </pic:pic>
+                    </a:graphicData>
+                  </a:graphic>
+                </wp:inline>
+              </w:drawing>
+            </w:r>
+          </w:p>
+          <w:p>
+            <w:pPr>
+              <w:jc w:val="center"/>
+            </w:pPr>
+            <w:r>
+              <w:rPr>
+                <w:b/>
+                <w:color w:val="57534E"/>
+                <w:sz w:val="16"/>
+              </w:rPr>
+              <w:t xml:space="preserve">Figura 1. </w:t>
+            </w:r>
+            <w:r>
+              <w:rPr>
+                <w:color w:val="57534E"/>
+                <w:sz w:val="16"/>
+              </w:rPr>
+              <w:t>Motor de sugerencias (C11): traslados sugeridos con su puntaje.</w:t>
+            </w:r>
+          </w:p>
+        </w:tc>
+        <w:tc>
+          <w:tcPr>
+            <w:tcW w:type="dxa" w:w="3061"/>
+          </w:tcPr>
+          <w:p>
+            <w:pPr>
+              <w:jc w:val="center"/>
+            </w:pPr>
+            <w:r>
+              <w:drawing>
+                <wp:inline xmlns:a="http://schemas.openxmlformats.org/drawingml/2006/main" xmlns:pic="http://schemas.openxmlformats.org/drawingml/2006/picture">
+                  <wp:extent cx="1655946" cy="3583637"/>
+                  <wp:docPr id="2" name="Picture 2"/>
+                  <wp:cNvGraphicFramePr>
+                    <a:graphicFrameLocks noChangeAspect="1"/>
+                  </wp:cNvGraphicFramePr>
+                  <a:graphic>
+                    <a:graphicData uri="http://schemas.openxmlformats.org/drawingml/2006/picture">
+                      <pic:pic>
+                        <pic:nvPicPr>
+                          <pic:cNvPr id="0" name="c12-remisiones.png"/>
+                          <pic:cNvPicPr/>
+                        </pic:nvPicPr>
+                        <pic:blipFill>
+                          <a:blip r:embed="rId28"/>
+                          <a:stretch>
+                            <a:fillRect/>
+                          </a:stretch>
+                        </pic:blipFill>
+                        <pic:spPr>
+                          <a:xfrm>
+                            <a:off x="0" y="0"/>
+                            <a:ext cx="1655946" cy="3583637"/>
+                          </a:xfrm>
+                          <a:prstGeom prst="rect"/>
+                        </pic:spPr>
+                      </pic:pic>
+                    </a:graphicData>
+                  </a:graphic>
+                </wp:inline>
+              </w:drawing>
+            </w:r>
+          </w:p>
+          <w:p>
+            <w:pPr>
+              <w:jc w:val="center"/>
+            </w:pPr>
+            <w:r>
+              <w:rPr>
+                <w:b/>
+                <w:color w:val="57534E"/>
+                <w:sz w:val="16"/>
+              </w:rPr>
+              <w:t xml:space="preserve">Figura 2. </w:t>
+            </w:r>
+            <w:r>
+              <w:rPr>
+                <w:color w:val="57534E"/>
+                <w:sz w:val="16"/>
+              </w:rPr>
+              <w:t>Remisiones (C12): la remisión en borrador, lista para despachar.</w:t>
+            </w:r>
+          </w:p>
+        </w:tc>
+        <w:tc>
+          <w:tcPr>
+            <w:tcW w:type="dxa" w:w="3061"/>
+          </w:tcPr>
+          <w:p>
+            <w:pPr>
+              <w:jc w:val="center"/>
+            </w:pPr>
+            <w:r>
+              <w:drawing>
+                <wp:inline xmlns:a="http://schemas.openxmlformats.org/drawingml/2006/main" xmlns:pic="http://schemas.openxmlformats.org/drawingml/2006/picture">
+                  <wp:extent cx="1655946" cy="3495886"/>
+                  <wp:docPr id="3" name="Picture 3"/>
+                  <wp:cNvGraphicFramePr>
+                    <a:graphicFrameLocks noChangeAspect="1"/>
+                  </wp:cNvGraphicFramePr>
+                  <a:graphic>
+                    <a:graphicData uri="http://schemas.openxmlformats.org/drawingml/2006/picture">
+                      <pic:pic>
+                        <pic:nvPicPr>
+                          <pic:cNvPr id="0" name="c12-documento.png"/>
+                          <pic:cNvPicPr/>
+                        </pic:nvPicPr>
+                        <pic:blipFill>
+                          <a:blip r:embed="rId29"/>
+                          <a:stretch>
+                            <a:fillRect/>
+                          </a:stretch>
+                        </pic:blipFill>
+                        <pic:spPr>
+                          <a:xfrm>
+                            <a:off x="0" y="0"/>
+                            <a:ext cx="1655946" cy="3495886"/>
+                          </a:xfrm>
+                          <a:prstGeom prst="rect"/>
+                        </pic:spPr>
+                      </pic:pic>
+                    </a:graphicData>
+                  </a:graphic>
+                </wp:inline>
+              </w:drawing>
+            </w:r>
+          </w:p>
+          <w:p>
+            <w:pPr>
+              <w:jc w:val="center"/>
+            </w:pPr>
+            <w:r>
+              <w:rPr>
+                <w:b/>
+                <w:color w:val="57534E"/>
+                <w:sz w:val="16"/>
+              </w:rPr>
+              <w:t xml:space="preserve">Figura 3. </w:t>
+            </w:r>
+            <w:r>
+              <w:rPr>
+                <w:color w:val="57534E"/>
+                <w:sz w:val="16"/>
+              </w:rPr>
+              <w:t>Documento de una remisión despachada, con su QR.</w:t>
+            </w:r>
+          </w:p>
+        </w:tc>
+      </w:tr>
+    </w:tbl>
+    <w:p>
+      <w:pPr>
+        <w:spacing w:after="80"/>
+      </w:pPr>
     </w:p>
+    <w:tbl>
+      <w:tblPr>
+        <w:tblW w:type="auto" w:w="0"/>
+        <w:jc w:val="center"/>
+        <w:tblLook w:firstColumn="1" w:firstRow="1" w:lastColumn="0" w:lastRow="0" w:noHBand="0" w:noVBand="1" w:val="04A0"/>
+      </w:tblPr>
+      <w:tblGrid>
+        <w:gridCol w:w="3061"/>
+        <w:gridCol w:w="3061"/>
+        <w:gridCol w:w="3061"/>
+      </w:tblGrid>
+      <w:tr>
+        <w:trPr>
+          <w:cantSplit w:val="true"/>
+        </w:trPr>
+        <w:tc>
+          <w:tcPr>
+            <w:tcW w:type="dxa" w:w="3061"/>
+          </w:tcPr>
+          <w:p>
+            <w:pPr>
+              <w:jc w:val="center"/>
+            </w:pPr>
+            <w:r>
+              <w:drawing>
+                <wp:inline xmlns:a="http://schemas.openxmlformats.org/drawingml/2006/main" xmlns:pic="http://schemas.openxmlformats.org/drawingml/2006/picture">
+                  <wp:extent cx="1655946" cy="2943904"/>
+                  <wp:docPr id="4" name="Picture 4"/>
+                  <wp:cNvGraphicFramePr>
+                    <a:graphicFrameLocks noChangeAspect="1"/>
+                  </wp:cNvGraphicFramePr>
+                  <a:graphic>
+                    <a:graphicData uri="http://schemas.openxmlformats.org/drawingml/2006/picture">
+                      <pic:pic>
+                        <pic:nvPicPr>
+                          <pic:cNvPr id="0" name="c13-recibida.png"/>
+                          <pic:cNvPicPr/>
+                        </pic:nvPicPr>
+                        <pic:blipFill>
+                          <a:blip r:embed="rId30"/>
+                          <a:stretch>
+                            <a:fillRect/>
+                          </a:stretch>
+                        </pic:blipFill>
+                        <pic:spPr>
+                          <a:xfrm>
+                            <a:off x="0" y="0"/>
+                            <a:ext cx="1655946" cy="2943904"/>
+                          </a:xfrm>
+                          <a:prstGeom prst="rect"/>
+                        </pic:spPr>
+                      </pic:pic>
+                    </a:graphicData>
+                  </a:graphic>
+                </wp:inline>
+              </w:drawing>
+            </w:r>
+          </w:p>
+          <w:p>
+            <w:pPr>
+              <w:jc w:val="center"/>
+            </w:pPr>
+            <w:r>
+              <w:rPr>
+                <w:b/>
+                <w:color w:val="57534E"/>
+                <w:sz w:val="16"/>
+              </w:rPr>
+              <w:t xml:space="preserve">Figura 4. </w:t>
+            </w:r>
+            <w:r>
+              <w:rPr>
+                <w:color w:val="57534E"/>
+                <w:sz w:val="16"/>
+              </w:rPr>
+              <w:t>Recepción en la zona (C13): confirmación de una remisión recibida.</w:t>
+            </w:r>
+          </w:p>
+        </w:tc>
+        <w:tc>
+          <w:tcPr>
+            <w:tcW w:type="dxa" w:w="3061"/>
+          </w:tcPr>
+          <w:p/>
+        </w:tc>
+        <w:tc>
+          <w:tcPr>
+            <w:tcW w:type="dxa" w:w="3061"/>
+          </w:tcPr>
+          <w:p/>
+        </w:tc>
+      </w:tr>
+    </w:tbl>
     <w:p>
       <w:pPr>
-        <w:pStyle w:val="Vineta"/>
-      </w:pPr>
-      <w:r>
-        <w:t xml:space="preserve">1. </w:t>
-      </w:r>
-      <w:r>
-        <w:t>En la zona, el Receptor escanea el QR o escribe el código, confirma lo que llegó y adjunta una foto. La pantalla confirma la recepción y lleva a la ficha de la zona. Si el código no es de una remisión, responde «Ese código no es el QR de una remisión»; si la remisión ya se recibió, «Esta remisión ya no está en camino a tus zonas».</w:t>
-      </w:r>
-    </w:p>
-    <w:p>
-      <w:pPr>
-        <w:keepNext/>
-        <w:spacing w:after="40"/>
-        <w:jc w:val="center"/>
-      </w:pPr>
-      <w:r>
-        <w:drawing>
-          <wp:inline xmlns:a="http://schemas.openxmlformats.org/drawingml/2006/main" xmlns:pic="http://schemas.openxmlformats.org/drawingml/2006/picture">
-            <wp:extent cx="2430000" cy="4320000"/>
-            <wp:docPr id="4" name="Picture 4"/>
-            <wp:cNvGraphicFramePr>
-              <a:graphicFrameLocks noChangeAspect="1"/>
-            </wp:cNvGraphicFramePr>
-            <a:graphic>
-              <a:graphicData uri="http://schemas.openxmlformats.org/drawingml/2006/picture">
-                <pic:pic>
-                  <pic:nvPicPr>
-                    <pic:cNvPr id="0" name="c13-recibida.png"/>
-                    <pic:cNvPicPr/>
-                  </pic:nvPicPr>
-                  <pic:blipFill>
-                    <a:blip r:embed="rId30"/>
-                    <a:stretch>
-                      <a:fillRect/>
-                    </a:stretch>
-                  </pic:blipFill>
-                  <pic:spPr>
-                    <a:xfrm>
-                      <a:off x="0" y="0"/>
-                      <a:ext cx="2430000" cy="4320000"/>
-                    </a:xfrm>
-                    <a:prstGeom prst="rect"/>
-                  </pic:spPr>
-                </pic:pic>
-              </a:graphicData>
-            </a:graphic>
-          </wp:inline>
-        </w:drawing>
-      </w:r>
-    </w:p>
-    <w:p>
-      <w:pPr>
-        <w:jc w:val="center"/>
-      </w:pPr>
-      <w:r>
-        <w:rPr>
-          <w:b/>
-          <w:color w:val="57534E"/>
-          <w:sz w:val="18"/>
-        </w:rPr>
-        <w:t xml:space="preserve">Figura 4. </w:t>
-      </w:r>
-      <w:r>
-        <w:rPr>
-          <w:color w:val="57534E"/>
-          <w:sz w:val="18"/>
-        </w:rPr>
-        <w:t>Recepción en la zona (C13): confirmación de una remisión recibida.</w:t>
-      </w:r>
-    </w:p>
-    <w:p>
-      <w:r>
-        <w:t>HU-13 Contar lo que la fórmula no ve se cubre desde «Mi zona»: el Receptor reporta una necesidad que el cálculo no conoce, y el motor la toma en cuenta al recalcular.</w:t>
-      </w:r>
+        <w:spacing w:after="80"/>
+      </w:pPr>
     </w:p>
     <w:p>
       <w:pPr>
@@ -706,71 +774,10 @@
     </w:p>
     <w:p>
       <w:pPr>
-        <w:keepNext/>
-        <w:spacing w:after="40"/>
-        <w:jc w:val="center"/>
-      </w:pPr>
-      <w:r>
-        <w:drawing>
-          <wp:inline xmlns:a="http://schemas.openxmlformats.org/drawingml/2006/main" xmlns:pic="http://schemas.openxmlformats.org/drawingml/2006/picture">
-            <wp:extent cx="1996208" cy="4319999"/>
-            <wp:docPr id="5" name="Picture 5"/>
-            <wp:cNvGraphicFramePr>
-              <a:graphicFrameLocks noChangeAspect="1"/>
-            </wp:cNvGraphicFramePr>
-            <a:graphic>
-              <a:graphicData uri="http://schemas.openxmlformats.org/drawingml/2006/picture">
-                <pic:pic>
-                  <pic:nvPicPr>
-                    <pic:cNvPr id="0" name="p03-causas.png"/>
-                    <pic:cNvPicPr/>
-                  </pic:nvPicPr>
-                  <pic:blipFill>
-                    <a:blip r:embed="rId31"/>
-                    <a:stretch>
-                      <a:fillRect/>
-                    </a:stretch>
-                  </pic:blipFill>
-                  <pic:spPr>
-                    <a:xfrm>
-                      <a:off x="0" y="0"/>
-                      <a:ext cx="1996208" cy="4319999"/>
-                    </a:xfrm>
-                    <a:prstGeom prst="rect"/>
-                  </pic:spPr>
-                </pic:pic>
-              </a:graphicData>
-            </a:graphic>
-          </wp:inline>
-        </w:drawing>
-      </w:r>
-    </w:p>
-    <w:p>
-      <w:pPr>
-        <w:jc w:val="center"/>
-      </w:pPr>
-      <w:r>
-        <w:rPr>
-          <w:b/>
-          <w:color w:val="57534E"/>
-          <w:sz w:val="18"/>
-        </w:rPr>
-        <w:t xml:space="preserve">Figura 5. </w:t>
-      </w:r>
-      <w:r>
-        <w:rPr>
-          <w:color w:val="57534E"/>
-          <w:sz w:val="18"/>
-        </w:rPr>
-        <w:t>Directorio de causas (P3).</w:t>
-      </w:r>
-    </w:p>
-    <w:p>
-      <w:pPr>
         <w:pStyle w:val="Vineta"/>
       </w:pPr>
       <w:r>
-        <w:t xml:space="preserve">1. </w:t>
+        <w:t xml:space="preserve">2. </w:t>
       </w:r>
       <w:r>
         <w:t xml:space="preserve">La </w:t>
@@ -787,404 +794,564 @@
     </w:p>
     <w:p>
       <w:pPr>
-        <w:keepNext/>
-        <w:spacing w:after="40"/>
-        <w:jc w:val="center"/>
-      </w:pPr>
-      <w:r>
-        <w:drawing>
-          <wp:inline xmlns:a="http://schemas.openxmlformats.org/drawingml/2006/main" xmlns:pic="http://schemas.openxmlformats.org/drawingml/2006/picture">
-            <wp:extent cx="1996208" cy="4319999"/>
-            <wp:docPr id="6" name="Picture 6"/>
-            <wp:cNvGraphicFramePr>
-              <a:graphicFrameLocks noChangeAspect="1"/>
-            </wp:cNvGraphicFramePr>
-            <a:graphic>
-              <a:graphicData uri="http://schemas.openxmlformats.org/drawingml/2006/picture">
-                <pic:pic>
-                  <pic:nvPicPr>
-                    <pic:cNvPr id="0" name="p04-ficha-causa.png"/>
-                    <pic:cNvPicPr/>
-                  </pic:nvPicPr>
-                  <pic:blipFill>
-                    <a:blip r:embed="rId32"/>
-                    <a:stretch>
-                      <a:fillRect/>
-                    </a:stretch>
-                  </pic:blipFill>
-                  <pic:spPr>
-                    <a:xfrm>
-                      <a:off x="0" y="0"/>
-                      <a:ext cx="1996208" cy="4319999"/>
-                    </a:xfrm>
-                    <a:prstGeom prst="rect"/>
-                  </pic:spPr>
-                </pic:pic>
-              </a:graphicData>
-            </a:graphic>
-          </wp:inline>
-        </w:drawing>
+        <w:pStyle w:val="Vineta"/>
+      </w:pPr>
+      <w:r>
+        <w:t xml:space="preserve">3. </w:t>
+      </w:r>
+      <w:r>
+        <w:t>Al tocar «Ir al sitio oficial», una hoja avisa que la persona sale de Acopio y que Acopio no recibe dinero ni ve sus pagos. Solo después de confirmar se abre el sitio.</w:t>
       </w:r>
     </w:p>
     <w:p>
       <w:pPr>
+        <w:pStyle w:val="Vineta"/>
+      </w:pPr>
+      <w:r>
+        <w:t xml:space="preserve">4. </w:t>
+      </w:r>
+      <w:r>
+        <w:t>En la consola, el Administrador verifica la entidad (C15). El botón de verificar empieza inactivo hasta marcar la casilla del aviso de seguridad. Después publica la causa (C22), donde el formulario solo ofrece entidades verificadas. Si a una entidad se le quita la verificación, sus causas pasan a «atendidas» y la ficha pública pierde el sello y el enlace.</w:t>
+      </w:r>
+    </w:p>
+    <w:tbl>
+      <w:tblPr>
+        <w:tblW w:type="auto" w:w="0"/>
         <w:jc w:val="center"/>
-      </w:pPr>
-      <w:r>
-        <w:rPr>
-          <w:b/>
-          <w:color w:val="57534E"/>
-          <w:sz w:val="18"/>
-        </w:rPr>
-        <w:t xml:space="preserve">Figura 6. </w:t>
-      </w:r>
-      <w:r>
-        <w:rPr>
-          <w:color w:val="57534E"/>
-          <w:sz w:val="18"/>
-        </w:rPr>
-        <w:t>Ficha de una causa (P4).</w:t>
-      </w:r>
+        <w:tblLook w:firstColumn="1" w:firstRow="1" w:lastColumn="0" w:lastRow="0" w:noHBand="0" w:noVBand="1" w:val="04A0"/>
+      </w:tblPr>
+      <w:tblGrid>
+        <w:gridCol w:w="3061"/>
+        <w:gridCol w:w="3061"/>
+        <w:gridCol w:w="3061"/>
+      </w:tblGrid>
+      <w:tr>
+        <w:trPr>
+          <w:cantSplit w:val="true"/>
+        </w:trPr>
+        <w:tc>
+          <w:tcPr>
+            <w:tcW w:type="dxa" w:w="3061"/>
+          </w:tcPr>
+          <w:p>
+            <w:pPr>
+              <w:jc w:val="center"/>
+            </w:pPr>
+            <w:r>
+              <w:drawing>
+                <wp:inline xmlns:a="http://schemas.openxmlformats.org/drawingml/2006/main" xmlns:pic="http://schemas.openxmlformats.org/drawingml/2006/picture">
+                  <wp:extent cx="1655946" cy="3583637"/>
+                  <wp:docPr id="5" name="Picture 5"/>
+                  <wp:cNvGraphicFramePr>
+                    <a:graphicFrameLocks noChangeAspect="1"/>
+                  </wp:cNvGraphicFramePr>
+                  <a:graphic>
+                    <a:graphicData uri="http://schemas.openxmlformats.org/drawingml/2006/picture">
+                      <pic:pic>
+                        <pic:nvPicPr>
+                          <pic:cNvPr id="0" name="p03-causas.png"/>
+                          <pic:cNvPicPr/>
+                        </pic:nvPicPr>
+                        <pic:blipFill>
+                          <a:blip r:embed="rId31"/>
+                          <a:stretch>
+                            <a:fillRect/>
+                          </a:stretch>
+                        </pic:blipFill>
+                        <pic:spPr>
+                          <a:xfrm>
+                            <a:off x="0" y="0"/>
+                            <a:ext cx="1655946" cy="3583637"/>
+                          </a:xfrm>
+                          <a:prstGeom prst="rect"/>
+                        </pic:spPr>
+                      </pic:pic>
+                    </a:graphicData>
+                  </a:graphic>
+                </wp:inline>
+              </w:drawing>
+            </w:r>
+          </w:p>
+          <w:p>
+            <w:pPr>
+              <w:jc w:val="center"/>
+            </w:pPr>
+            <w:r>
+              <w:rPr>
+                <w:b/>
+                <w:color w:val="57534E"/>
+                <w:sz w:val="16"/>
+              </w:rPr>
+              <w:t xml:space="preserve">Figura 5. </w:t>
+            </w:r>
+            <w:r>
+              <w:rPr>
+                <w:color w:val="57534E"/>
+                <w:sz w:val="16"/>
+              </w:rPr>
+              <w:t>Directorio de causas (P3).</w:t>
+            </w:r>
+          </w:p>
+        </w:tc>
+        <w:tc>
+          <w:tcPr>
+            <w:tcW w:type="dxa" w:w="3061"/>
+          </w:tcPr>
+          <w:p>
+            <w:pPr>
+              <w:jc w:val="center"/>
+            </w:pPr>
+            <w:r>
+              <w:drawing>
+                <wp:inline xmlns:a="http://schemas.openxmlformats.org/drawingml/2006/main" xmlns:pic="http://schemas.openxmlformats.org/drawingml/2006/picture">
+                  <wp:extent cx="1655946" cy="3583637"/>
+                  <wp:docPr id="6" name="Picture 6"/>
+                  <wp:cNvGraphicFramePr>
+                    <a:graphicFrameLocks noChangeAspect="1"/>
+                  </wp:cNvGraphicFramePr>
+                  <a:graphic>
+                    <a:graphicData uri="http://schemas.openxmlformats.org/drawingml/2006/picture">
+                      <pic:pic>
+                        <pic:nvPicPr>
+                          <pic:cNvPr id="0" name="p04-ficha-causa.png"/>
+                          <pic:cNvPicPr/>
+                        </pic:nvPicPr>
+                        <pic:blipFill>
+                          <a:blip r:embed="rId32"/>
+                          <a:stretch>
+                            <a:fillRect/>
+                          </a:stretch>
+                        </pic:blipFill>
+                        <pic:spPr>
+                          <a:xfrm>
+                            <a:off x="0" y="0"/>
+                            <a:ext cx="1655946" cy="3583637"/>
+                          </a:xfrm>
+                          <a:prstGeom prst="rect"/>
+                        </pic:spPr>
+                      </pic:pic>
+                    </a:graphicData>
+                  </a:graphic>
+                </wp:inline>
+              </w:drawing>
+            </w:r>
+          </w:p>
+          <w:p>
+            <w:pPr>
+              <w:jc w:val="center"/>
+            </w:pPr>
+            <w:r>
+              <w:rPr>
+                <w:b/>
+                <w:color w:val="57534E"/>
+                <w:sz w:val="16"/>
+              </w:rPr>
+              <w:t xml:space="preserve">Figura 6. </w:t>
+            </w:r>
+            <w:r>
+              <w:rPr>
+                <w:color w:val="57534E"/>
+                <w:sz w:val="16"/>
+              </w:rPr>
+              <w:t>Ficha de una causa (P4).</w:t>
+            </w:r>
+          </w:p>
+        </w:tc>
+        <w:tc>
+          <w:tcPr>
+            <w:tcW w:type="dxa" w:w="3061"/>
+          </w:tcPr>
+          <w:p>
+            <w:pPr>
+              <w:jc w:val="center"/>
+            </w:pPr>
+            <w:r>
+              <w:drawing>
+                <wp:inline xmlns:a="http://schemas.openxmlformats.org/drawingml/2006/main" xmlns:pic="http://schemas.openxmlformats.org/drawingml/2006/picture">
+                  <wp:extent cx="1655946" cy="3583637"/>
+                  <wp:docPr id="7" name="Picture 7"/>
+                  <wp:cNvGraphicFramePr>
+                    <a:graphicFrameLocks noChangeAspect="1"/>
+                  </wp:cNvGraphicFramePr>
+                  <a:graphic>
+                    <a:graphicData uri="http://schemas.openxmlformats.org/drawingml/2006/picture">
+                      <pic:pic>
+                        <pic:nvPicPr>
+                          <pic:cNvPr id="0" name="p04-salida.png"/>
+                          <pic:cNvPicPr/>
+                        </pic:nvPicPr>
+                        <pic:blipFill>
+                          <a:blip r:embed="rId33"/>
+                          <a:stretch>
+                            <a:fillRect/>
+                          </a:stretch>
+                        </pic:blipFill>
+                        <pic:spPr>
+                          <a:xfrm>
+                            <a:off x="0" y="0"/>
+                            <a:ext cx="1655946" cy="3583637"/>
+                          </a:xfrm>
+                          <a:prstGeom prst="rect"/>
+                        </pic:spPr>
+                      </pic:pic>
+                    </a:graphicData>
+                  </a:graphic>
+                </wp:inline>
+              </w:drawing>
+            </w:r>
+          </w:p>
+          <w:p>
+            <w:pPr>
+              <w:jc w:val="center"/>
+            </w:pPr>
+            <w:r>
+              <w:rPr>
+                <w:b/>
+                <w:color w:val="57534E"/>
+                <w:sz w:val="16"/>
+              </w:rPr>
+              <w:t xml:space="preserve">Figura 7. </w:t>
+            </w:r>
+            <w:r>
+              <w:rPr>
+                <w:color w:val="57534E"/>
+                <w:sz w:val="16"/>
+              </w:rPr>
+              <w:t>Aviso antes de salir al sitio oficial de la entidad.</w:t>
+            </w:r>
+          </w:p>
+        </w:tc>
+      </w:tr>
+    </w:tbl>
+    <w:p>
+      <w:pPr>
+        <w:spacing w:after="80"/>
+      </w:pPr>
+    </w:p>
+    <w:tbl>
+      <w:tblPr>
+        <w:tblW w:type="auto" w:w="0"/>
+        <w:jc w:val="center"/>
+        <w:tblLook w:firstColumn="1" w:firstRow="1" w:lastColumn="0" w:lastRow="0" w:noHBand="0" w:noVBand="1" w:val="04A0"/>
+      </w:tblPr>
+      <w:tblGrid>
+        <w:gridCol w:w="3061"/>
+        <w:gridCol w:w="3061"/>
+        <w:gridCol w:w="3061"/>
+      </w:tblGrid>
+      <w:tr>
+        <w:trPr>
+          <w:cantSplit w:val="true"/>
+        </w:trPr>
+        <w:tc>
+          <w:tcPr>
+            <w:tcW w:type="dxa" w:w="3061"/>
+          </w:tcPr>
+          <w:p>
+            <w:pPr>
+              <w:jc w:val="center"/>
+            </w:pPr>
+            <w:r>
+              <w:drawing>
+                <wp:inline xmlns:a="http://schemas.openxmlformats.org/drawingml/2006/main" xmlns:pic="http://schemas.openxmlformats.org/drawingml/2006/picture">
+                  <wp:extent cx="1655946" cy="3583637"/>
+                  <wp:docPr id="8" name="Picture 8"/>
+                  <wp:cNvGraphicFramePr>
+                    <a:graphicFrameLocks noChangeAspect="1"/>
+                  </wp:cNvGraphicFramePr>
+                  <a:graphic>
+                    <a:graphicData uri="http://schemas.openxmlformats.org/drawingml/2006/picture">
+                      <pic:pic>
+                        <pic:nvPicPr>
+                          <pic:cNvPr id="0" name="c22-causas.png"/>
+                          <pic:cNvPicPr/>
+                        </pic:nvPicPr>
+                        <pic:blipFill>
+                          <a:blip r:embed="rId34"/>
+                          <a:stretch>
+                            <a:fillRect/>
+                          </a:stretch>
+                        </pic:blipFill>
+                        <pic:spPr>
+                          <a:xfrm>
+                            <a:off x="0" y="0"/>
+                            <a:ext cx="1655946" cy="3583637"/>
+                          </a:xfrm>
+                          <a:prstGeom prst="rect"/>
+                        </pic:spPr>
+                      </pic:pic>
+                    </a:graphicData>
+                  </a:graphic>
+                </wp:inline>
+              </w:drawing>
+            </w:r>
+          </w:p>
+          <w:p>
+            <w:pPr>
+              <w:jc w:val="center"/>
+            </w:pPr>
+            <w:r>
+              <w:rPr>
+                <w:b/>
+                <w:color w:val="57534E"/>
+                <w:sz w:val="16"/>
+              </w:rPr>
+              <w:t xml:space="preserve">Figura 8. </w:t>
+            </w:r>
+            <w:r>
+              <w:rPr>
+                <w:color w:val="57534E"/>
+                <w:sz w:val="16"/>
+              </w:rPr>
+              <w:t>Causas en la consola (C22).</w:t>
+            </w:r>
+          </w:p>
+        </w:tc>
+        <w:tc>
+          <w:tcPr>
+            <w:tcW w:type="dxa" w:w="3061"/>
+          </w:tcPr>
+          <w:p/>
+        </w:tc>
+        <w:tc>
+          <w:tcPr>
+            <w:tcW w:type="dxa" w:w="3061"/>
+          </w:tcPr>
+          <w:p/>
+        </w:tc>
+      </w:tr>
+    </w:tbl>
+    <w:p>
+      <w:pPr>
+        <w:spacing w:after="80"/>
+      </w:pPr>
     </w:p>
     <w:p>
       <w:pPr>
-        <w:pStyle w:val="Vineta"/>
-      </w:pPr>
-      <w:r>
-        <w:t xml:space="preserve">1. </w:t>
-      </w:r>
-      <w:r>
-        <w:t>Al tocar «Ir al sitio oficial», una hoja avisa que la persona sale de Acopio y que Acopio no recibe dinero ni ve sus pagos. Solo después de confirmar se abre el sitio.</w:t>
+        <w:pStyle w:val="Ttulo2"/>
+      </w:pPr>
+      <w:r>
+        <w:t>1c. Otras pantallas del incremento</w:t>
       </w:r>
     </w:p>
     <w:p>
-      <w:pPr>
-        <w:keepNext/>
-        <w:spacing w:after="40"/>
+      <w:r>
+        <w:t>El incremento tiene más pantallas que las de los dos flujos. Estas también leen la base de la demo del servidor.</w:t>
+      </w:r>
+    </w:p>
+    <w:tbl>
+      <w:tblPr>
+        <w:tblW w:type="auto" w:w="0"/>
         <w:jc w:val="center"/>
-      </w:pPr>
-      <w:r>
-        <w:drawing>
-          <wp:inline xmlns:a="http://schemas.openxmlformats.org/drawingml/2006/main" xmlns:pic="http://schemas.openxmlformats.org/drawingml/2006/picture">
-            <wp:extent cx="1996208" cy="4319999"/>
-            <wp:docPr id="7" name="Picture 7"/>
-            <wp:cNvGraphicFramePr>
-              <a:graphicFrameLocks noChangeAspect="1"/>
-            </wp:cNvGraphicFramePr>
-            <a:graphic>
-              <a:graphicData uri="http://schemas.openxmlformats.org/drawingml/2006/picture">
-                <pic:pic>
-                  <pic:nvPicPr>
-                    <pic:cNvPr id="0" name="p04-salida.png"/>
-                    <pic:cNvPicPr/>
-                  </pic:nvPicPr>
-                  <pic:blipFill>
-                    <a:blip r:embed="rId33"/>
-                    <a:stretch>
-                      <a:fillRect/>
-                    </a:stretch>
-                  </pic:blipFill>
-                  <pic:spPr>
-                    <a:xfrm>
-                      <a:off x="0" y="0"/>
-                      <a:ext cx="1996208" cy="4319999"/>
-                    </a:xfrm>
-                    <a:prstGeom prst="rect"/>
-                  </pic:spPr>
-                </pic:pic>
-              </a:graphicData>
-            </a:graphic>
-          </wp:inline>
-        </w:drawing>
-      </w:r>
-    </w:p>
+        <w:tblLook w:firstColumn="1" w:firstRow="1" w:lastColumn="0" w:lastRow="0" w:noHBand="0" w:noVBand="1" w:val="04A0"/>
+      </w:tblPr>
+      <w:tblGrid>
+        <w:gridCol w:w="3061"/>
+        <w:gridCol w:w="3061"/>
+        <w:gridCol w:w="3061"/>
+      </w:tblGrid>
+      <w:tr>
+        <w:trPr>
+          <w:cantSplit w:val="true"/>
+        </w:trPr>
+        <w:tc>
+          <w:tcPr>
+            <w:tcW w:type="dxa" w:w="3061"/>
+          </w:tcPr>
+          <w:p>
+            <w:pPr>
+              <w:jc w:val="center"/>
+            </w:pPr>
+            <w:r>
+              <w:drawing>
+                <wp:inline xmlns:a="http://schemas.openxmlformats.org/drawingml/2006/main" xmlns:pic="http://schemas.openxmlformats.org/drawingml/2006/picture">
+                  <wp:extent cx="1655946" cy="3583637"/>
+                  <wp:docPr id="9" name="Picture 9"/>
+                  <wp:cNvGraphicFramePr>
+                    <a:graphicFrameLocks noChangeAspect="1"/>
+                  </wp:cNvGraphicFramePr>
+                  <a:graphic>
+                    <a:graphicData uri="http://schemas.openxmlformats.org/drawingml/2006/picture">
+                      <pic:pic>
+                        <pic:nvPicPr>
+                          <pic:cNvPr id="0" name="p05-mapa.png"/>
+                          <pic:cNvPicPr/>
+                        </pic:nvPicPr>
+                        <pic:blipFill>
+                          <a:blip r:embed="rId35"/>
+                          <a:stretch>
+                            <a:fillRect/>
+                          </a:stretch>
+                        </pic:blipFill>
+                        <pic:spPr>
+                          <a:xfrm>
+                            <a:off x="0" y="0"/>
+                            <a:ext cx="1655946" cy="3583637"/>
+                          </a:xfrm>
+                          <a:prstGeom prst="rect"/>
+                        </pic:spPr>
+                      </pic:pic>
+                    </a:graphicData>
+                  </a:graphic>
+                </wp:inline>
+              </w:drawing>
+            </w:r>
+          </w:p>
+          <w:p>
+            <w:pPr>
+              <w:jc w:val="center"/>
+            </w:pPr>
+            <w:r>
+              <w:rPr>
+                <w:b/>
+                <w:color w:val="57534E"/>
+                <w:sz w:val="16"/>
+              </w:rPr>
+              <w:t xml:space="preserve">Figura 9. </w:t>
+            </w:r>
+            <w:r>
+              <w:rPr>
+                <w:color w:val="57534E"/>
+                <w:sz w:val="16"/>
+              </w:rPr>
+              <w:t>Mapa de acopios (P5): búsqueda por dirección, «Cerca de mí», filtros y mapa.</w:t>
+            </w:r>
+          </w:p>
+        </w:tc>
+        <w:tc>
+          <w:tcPr>
+            <w:tcW w:type="dxa" w:w="3061"/>
+          </w:tcPr>
+          <w:p>
+            <w:pPr>
+              <w:jc w:val="center"/>
+            </w:pPr>
+            <w:r>
+              <w:drawing>
+                <wp:inline xmlns:a="http://schemas.openxmlformats.org/drawingml/2006/main" xmlns:pic="http://schemas.openxmlformats.org/drawingml/2006/picture">
+                  <wp:extent cx="1655946" cy="3583637"/>
+                  <wp:docPr id="10" name="Picture 10"/>
+                  <wp:cNvGraphicFramePr>
+                    <a:graphicFrameLocks noChangeAspect="1"/>
+                  </wp:cNvGraphicFramePr>
+                  <a:graphic>
+                    <a:graphicData uri="http://schemas.openxmlformats.org/drawingml/2006/picture">
+                      <pic:pic>
+                        <pic:nvPicPr>
+                          <pic:cNvPr id="0" name="p07-voluntariado.png"/>
+                          <pic:cNvPicPr/>
+                        </pic:nvPicPr>
+                        <pic:blipFill>
+                          <a:blip r:embed="rId36"/>
+                          <a:stretch>
+                            <a:fillRect/>
+                          </a:stretch>
+                        </pic:blipFill>
+                        <pic:spPr>
+                          <a:xfrm>
+                            <a:off x="0" y="0"/>
+                            <a:ext cx="1655946" cy="3583637"/>
+                          </a:xfrm>
+                          <a:prstGeom prst="rect"/>
+                        </pic:spPr>
+                      </pic:pic>
+                    </a:graphicData>
+                  </a:graphic>
+                </wp:inline>
+              </w:drawing>
+            </w:r>
+          </w:p>
+          <w:p>
+            <w:pPr>
+              <w:jc w:val="center"/>
+            </w:pPr>
+            <w:r>
+              <w:rPr>
+                <w:b/>
+                <w:color w:val="57534E"/>
+                <w:sz w:val="16"/>
+              </w:rPr>
+              <w:t xml:space="preserve">Figura 10. </w:t>
+            </w:r>
+            <w:r>
+              <w:rPr>
+                <w:color w:val="57534E"/>
+                <w:sz w:val="16"/>
+              </w:rPr>
+              <w:t>Voluntariado (P7): jornadas por día con sus cupos reservados.</w:t>
+            </w:r>
+          </w:p>
+        </w:tc>
+        <w:tc>
+          <w:tcPr>
+            <w:tcW w:type="dxa" w:w="3061"/>
+          </w:tcPr>
+          <w:p>
+            <w:pPr>
+              <w:jc w:val="center"/>
+            </w:pPr>
+            <w:r>
+              <w:drawing>
+                <wp:inline xmlns:a="http://schemas.openxmlformats.org/drawingml/2006/main" xmlns:pic="http://schemas.openxmlformats.org/drawingml/2006/picture">
+                  <wp:extent cx="1655946" cy="3583637"/>
+                  <wp:docPr id="11" name="Picture 11"/>
+                  <wp:cNvGraphicFramePr>
+                    <a:graphicFrameLocks noChangeAspect="1"/>
+                  </wp:cNvGraphicFramePr>
+                  <a:graphic>
+                    <a:graphicData uri="http://schemas.openxmlformats.org/drawingml/2006/picture">
+                      <pic:pic>
+                        <pic:nvPicPr>
+                          <pic:cNvPr id="0" name="c14-turnos.png"/>
+                          <pic:cNvPicPr/>
+                        </pic:nvPicPr>
+                        <pic:blipFill>
+                          <a:blip r:embed="rId37"/>
+                          <a:stretch>
+                            <a:fillRect/>
+                          </a:stretch>
+                        </pic:blipFill>
+                        <pic:spPr>
+                          <a:xfrm>
+                            <a:off x="0" y="0"/>
+                            <a:ext cx="1655946" cy="3583637"/>
+                          </a:xfrm>
+                          <a:prstGeom prst="rect"/>
+                        </pic:spPr>
+                      </pic:pic>
+                    </a:graphicData>
+                  </a:graphic>
+                </wp:inline>
+              </w:drawing>
+            </w:r>
+          </w:p>
+          <w:p>
+            <w:pPr>
+              <w:jc w:val="center"/>
+            </w:pPr>
+            <w:r>
+              <w:rPr>
+                <w:b/>
+                <w:color w:val="57534E"/>
+                <w:sz w:val="16"/>
+              </w:rPr>
+              <w:t xml:space="preserve">Figura 11. </w:t>
+            </w:r>
+            <w:r>
+              <w:rPr>
+                <w:color w:val="57534E"/>
+                <w:sz w:val="16"/>
+              </w:rPr>
+              <w:t>Turnos en la consola (C14): jornadas próximas, en curso y pasadas, de acopios y de entidades.</w:t>
+            </w:r>
+          </w:p>
+        </w:tc>
+      </w:tr>
+    </w:tbl>
     <w:p>
       <w:pPr>
-        <w:jc w:val="center"/>
-      </w:pPr>
-      <w:r>
-        <w:rPr>
-          <w:b/>
-          <w:color w:val="57534E"/>
-          <w:sz w:val="18"/>
-        </w:rPr>
-        <w:t xml:space="preserve">Figura 7. </w:t>
-      </w:r>
-      <w:r>
-        <w:rPr>
-          <w:color w:val="57534E"/>
-          <w:sz w:val="18"/>
-        </w:rPr>
-        <w:t>Aviso antes de salir al sitio oficial de la entidad.</w:t>
-      </w:r>
-    </w:p>
-    <w:p>
-      <w:pPr>
-        <w:pStyle w:val="Vineta"/>
-      </w:pPr>
-      <w:r>
-        <w:t xml:space="preserve">1. </w:t>
-      </w:r>
-      <w:r>
-        <w:t>En la consola, el Administrador verifica la entidad (C15). El botón de verificar empieza inactivo hasta marcar la casilla del aviso de seguridad. Después publica la causa (C22), donde el formulario solo ofrece entidades verificadas. Si a una entidad se le quita la verificación, sus causas pasan a «atendidas» y la ficha pública pierde el sello y el enlace.</w:t>
-      </w:r>
-    </w:p>
-    <w:p>
-      <w:pPr>
-        <w:keepNext/>
-        <w:spacing w:after="40"/>
-        <w:jc w:val="center"/>
-      </w:pPr>
-      <w:r>
-        <w:drawing>
-          <wp:inline xmlns:a="http://schemas.openxmlformats.org/drawingml/2006/main" xmlns:pic="http://schemas.openxmlformats.org/drawingml/2006/picture">
-            <wp:extent cx="1996208" cy="4319999"/>
-            <wp:docPr id="8" name="Picture 8"/>
-            <wp:cNvGraphicFramePr>
-              <a:graphicFrameLocks noChangeAspect="1"/>
-            </wp:cNvGraphicFramePr>
-            <a:graphic>
-              <a:graphicData uri="http://schemas.openxmlformats.org/drawingml/2006/picture">
-                <pic:pic>
-                  <pic:nvPicPr>
-                    <pic:cNvPr id="0" name="c22-causas.png"/>
-                    <pic:cNvPicPr/>
-                  </pic:nvPicPr>
-                  <pic:blipFill>
-                    <a:blip r:embed="rId34"/>
-                    <a:stretch>
-                      <a:fillRect/>
-                    </a:stretch>
-                  </pic:blipFill>
-                  <pic:spPr>
-                    <a:xfrm>
-                      <a:off x="0" y="0"/>
-                      <a:ext cx="1996208" cy="4319999"/>
-                    </a:xfrm>
-                    <a:prstGeom prst="rect"/>
-                  </pic:spPr>
-                </pic:pic>
-              </a:graphicData>
-            </a:graphic>
-          </wp:inline>
-        </w:drawing>
-      </w:r>
-    </w:p>
-    <w:p>
-      <w:pPr>
-        <w:jc w:val="center"/>
-      </w:pPr>
-      <w:r>
-        <w:rPr>
-          <w:b/>
-          <w:color w:val="57534E"/>
-          <w:sz w:val="18"/>
-        </w:rPr>
-        <w:t xml:space="preserve">Figura 8. </w:t>
-      </w:r>
-      <w:r>
-        <w:rPr>
-          <w:color w:val="57534E"/>
-          <w:sz w:val="18"/>
-        </w:rPr>
-        <w:t>Causas en la consola (C22).</w:t>
-      </w:r>
-    </w:p>
-    <w:p>
-      <w:pPr>
-        <w:pStyle w:val="Ttulo2"/>
-      </w:pPr>
-      <w:r>
-        <w:t>1c. Otras pantallas del incremento</w:t>
-      </w:r>
-    </w:p>
-    <w:p>
-      <w:r>
-        <w:t>El incremento tiene más pantallas que las de los dos flujos. Estas también leen la base de la demo del servidor.</w:t>
-      </w:r>
-    </w:p>
-    <w:p>
-      <w:pPr>
-        <w:keepNext/>
-        <w:spacing w:after="40"/>
-        <w:jc w:val="center"/>
-      </w:pPr>
-      <w:r>
-        <w:drawing>
-          <wp:inline xmlns:a="http://schemas.openxmlformats.org/drawingml/2006/main" xmlns:pic="http://schemas.openxmlformats.org/drawingml/2006/picture">
-            <wp:extent cx="1996208" cy="4319999"/>
-            <wp:docPr id="9" name="Picture 9"/>
-            <wp:cNvGraphicFramePr>
-              <a:graphicFrameLocks noChangeAspect="1"/>
-            </wp:cNvGraphicFramePr>
-            <a:graphic>
-              <a:graphicData uri="http://schemas.openxmlformats.org/drawingml/2006/picture">
-                <pic:pic>
-                  <pic:nvPicPr>
-                    <pic:cNvPr id="0" name="p05-mapa.png"/>
-                    <pic:cNvPicPr/>
-                  </pic:nvPicPr>
-                  <pic:blipFill>
-                    <a:blip r:embed="rId35"/>
-                    <a:stretch>
-                      <a:fillRect/>
-                    </a:stretch>
-                  </pic:blipFill>
-                  <pic:spPr>
-                    <a:xfrm>
-                      <a:off x="0" y="0"/>
-                      <a:ext cx="1996208" cy="4319999"/>
-                    </a:xfrm>
-                    <a:prstGeom prst="rect"/>
-                  </pic:spPr>
-                </pic:pic>
-              </a:graphicData>
-            </a:graphic>
-          </wp:inline>
-        </w:drawing>
-      </w:r>
-    </w:p>
-    <w:p>
-      <w:pPr>
-        <w:jc w:val="center"/>
-      </w:pPr>
-      <w:r>
-        <w:rPr>
-          <w:b/>
-          <w:color w:val="57534E"/>
-          <w:sz w:val="18"/>
-        </w:rPr>
-        <w:t xml:space="preserve">Figura 9. </w:t>
-      </w:r>
-      <w:r>
-        <w:rPr>
-          <w:color w:val="57534E"/>
-          <w:sz w:val="18"/>
-        </w:rPr>
-        <w:t>Mapa de acopios (P5): búsqueda por dirección, «Cerca de mí», filtros y mapa.</w:t>
-      </w:r>
-    </w:p>
-    <w:p>
-      <w:pPr>
-        <w:keepNext/>
-        <w:spacing w:after="40"/>
-        <w:jc w:val="center"/>
-      </w:pPr>
-      <w:r>
-        <w:drawing>
-          <wp:inline xmlns:a="http://schemas.openxmlformats.org/drawingml/2006/main" xmlns:pic="http://schemas.openxmlformats.org/drawingml/2006/picture">
-            <wp:extent cx="1996208" cy="4319999"/>
-            <wp:docPr id="10" name="Picture 10"/>
-            <wp:cNvGraphicFramePr>
-              <a:graphicFrameLocks noChangeAspect="1"/>
-            </wp:cNvGraphicFramePr>
-            <a:graphic>
-              <a:graphicData uri="http://schemas.openxmlformats.org/drawingml/2006/picture">
-                <pic:pic>
-                  <pic:nvPicPr>
-                    <pic:cNvPr id="0" name="p07-voluntariado.png"/>
-                    <pic:cNvPicPr/>
-                  </pic:nvPicPr>
-                  <pic:blipFill>
-                    <a:blip r:embed="rId36"/>
-                    <a:stretch>
-                      <a:fillRect/>
-                    </a:stretch>
-                  </pic:blipFill>
-                  <pic:spPr>
-                    <a:xfrm>
-                      <a:off x="0" y="0"/>
-                      <a:ext cx="1996208" cy="4319999"/>
-                    </a:xfrm>
-                    <a:prstGeom prst="rect"/>
-                  </pic:spPr>
-                </pic:pic>
-              </a:graphicData>
-            </a:graphic>
-          </wp:inline>
-        </w:drawing>
-      </w:r>
-    </w:p>
-    <w:p>
-      <w:pPr>
-        <w:jc w:val="center"/>
-      </w:pPr>
-      <w:r>
-        <w:rPr>
-          <w:b/>
-          <w:color w:val="57534E"/>
-          <w:sz w:val="18"/>
-        </w:rPr>
-        <w:t xml:space="preserve">Figura 10. </w:t>
-      </w:r>
-      <w:r>
-        <w:rPr>
-          <w:color w:val="57534E"/>
-          <w:sz w:val="18"/>
-        </w:rPr>
-        <w:t>Voluntariado (P7): jornadas por día con sus cupos reservados.</w:t>
-      </w:r>
-    </w:p>
-    <w:p>
-      <w:pPr>
-        <w:keepNext/>
-        <w:spacing w:after="40"/>
-        <w:jc w:val="center"/>
-      </w:pPr>
-      <w:r>
-        <w:drawing>
-          <wp:inline xmlns:a="http://schemas.openxmlformats.org/drawingml/2006/main" xmlns:pic="http://schemas.openxmlformats.org/drawingml/2006/picture">
-            <wp:extent cx="1996208" cy="4319999"/>
-            <wp:docPr id="11" name="Picture 11"/>
-            <wp:cNvGraphicFramePr>
-              <a:graphicFrameLocks noChangeAspect="1"/>
-            </wp:cNvGraphicFramePr>
-            <a:graphic>
-              <a:graphicData uri="http://schemas.openxmlformats.org/drawingml/2006/picture">
-                <pic:pic>
-                  <pic:nvPicPr>
-                    <pic:cNvPr id="0" name="c14-turnos.png"/>
-                    <pic:cNvPicPr/>
-                  </pic:nvPicPr>
-                  <pic:blipFill>
-                    <a:blip r:embed="rId37"/>
-                    <a:stretch>
-                      <a:fillRect/>
-                    </a:stretch>
-                  </pic:blipFill>
-                  <pic:spPr>
-                    <a:xfrm>
-                      <a:off x="0" y="0"/>
-                      <a:ext cx="1996208" cy="4319999"/>
-                    </a:xfrm>
-                    <a:prstGeom prst="rect"/>
-                  </pic:spPr>
-                </pic:pic>
-              </a:graphicData>
-            </a:graphic>
-          </wp:inline>
-        </w:drawing>
-      </w:r>
-    </w:p>
-    <w:p>
-      <w:pPr>
-        <w:jc w:val="center"/>
-      </w:pPr>
-      <w:r>
-        <w:rPr>
-          <w:b/>
-          <w:color w:val="57534E"/>
-          <w:sz w:val="18"/>
-        </w:rPr>
-        <w:t xml:space="preserve">Figura 11. </w:t>
-      </w:r>
-      <w:r>
-        <w:rPr>
-          <w:color w:val="57534E"/>
-          <w:sz w:val="18"/>
-        </w:rPr>
-        <w:t>Turnos en la consola (C14): jornadas próximas, en curso y pasadas, de acopios y de entidades.</w:t>
-      </w:r>
+        <w:spacing w:after="80"/>
+      </w:pPr>
     </w:p>
     <w:p>
       <w:pPr>
@@ -1217,7 +1384,17 @@
         <w:t>docs/02-arquitectura/diagramas/paquetes.html</w:t>
       </w:r>
       <w:r>
-        <w:t xml:space="preserve"> y sus dependencias salen de dependency-cruiser. Los de contenedores y los modelos de datos se generan con Mermaid desde la misma carpeta.</w:t>
+        <w:t xml:space="preserve"> y sus dependencias salen de dependency-cruiser. Los modelos de datos de la red y de turnos se generan con Mermaid desde la misma carpeta; el resto de los diagramas está en la bóveda, en </w:t>
+      </w:r>
+      <w:r>
+        <w:rPr>
+          <w:rFonts w:ascii="Consolas" w:hAnsi="Consolas"/>
+          <w:sz w:val="19"/>
+        </w:rPr>
+        <w:t>docs/02-arquitectura/</w:t>
+      </w:r>
+      <w:r>
+        <w:t>.</w:t>
       </w:r>
     </w:p>
     <w:p>
@@ -1351,130 +1528,8 @@
       <w:r>
         <w:drawing>
           <wp:inline xmlns:a="http://schemas.openxmlformats.org/drawingml/2006/main" xmlns:pic="http://schemas.openxmlformats.org/drawingml/2006/picture">
-            <wp:extent cx="5575858" cy="4896375"/>
+            <wp:extent cx="8963660" cy="4410971"/>
             <wp:docPr id="14" name="Picture 14"/>
-            <wp:cNvGraphicFramePr>
-              <a:graphicFrameLocks noChangeAspect="1"/>
-            </wp:cNvGraphicFramePr>
-            <a:graphic>
-              <a:graphicData uri="http://schemas.openxmlformats.org/drawingml/2006/picture">
-                <pic:pic>
-                  <pic:nvPicPr>
-                    <pic:cNvPr id="0" name="arquitectura-02-contenedores.png"/>
-                    <pic:cNvPicPr/>
-                  </pic:nvPicPr>
-                  <pic:blipFill>
-                    <a:blip r:embed="rId40"/>
-                    <a:stretch>
-                      <a:fillRect/>
-                    </a:stretch>
-                  </pic:blipFill>
-                  <pic:spPr>
-                    <a:xfrm>
-                      <a:off x="0" y="0"/>
-                      <a:ext cx="5575858" cy="4896375"/>
-                    </a:xfrm>
-                    <a:prstGeom prst="rect"/>
-                  </pic:spPr>
-                </pic:pic>
-              </a:graphicData>
-            </a:graphic>
-          </wp:inline>
-        </w:drawing>
-      </w:r>
-    </w:p>
-    <w:p>
-      <w:pPr>
-        <w:jc w:val="center"/>
-      </w:pPr>
-      <w:r>
-        <w:rPr>
-          <w:b/>
-          <w:color w:val="57534E"/>
-          <w:sz w:val="18"/>
-        </w:rPr>
-        <w:t xml:space="preserve">Figura 14. </w:t>
-      </w:r>
-      <w:r>
-        <w:rPr>
-          <w:color w:val="57534E"/>
-          <w:sz w:val="18"/>
-        </w:rPr>
-        <w:t>Contenedores: el navegador, la web y la API en el VPS con Dokploy, y los servicios externos (Supabase Auth, SMTP, Nominatim, OpenStreetMap y RedAcopio).</w:t>
-      </w:r>
-    </w:p>
-    <w:p>
-      <w:pPr>
-        <w:keepNext/>
-        <w:spacing w:after="40"/>
-        <w:jc w:val="center"/>
-      </w:pPr>
-      <w:r>
-        <w:drawing>
-          <wp:inline xmlns:a="http://schemas.openxmlformats.org/drawingml/2006/main" xmlns:pic="http://schemas.openxmlformats.org/drawingml/2006/picture">
-            <wp:extent cx="8963660" cy="2336306"/>
-            <wp:docPr id="15" name="Picture 15"/>
-            <wp:cNvGraphicFramePr>
-              <a:graphicFrameLocks noChangeAspect="1"/>
-            </wp:cNvGraphicFramePr>
-            <a:graphic>
-              <a:graphicData uri="http://schemas.openxmlformats.org/drawingml/2006/picture">
-                <pic:pic>
-                  <pic:nvPicPr>
-                    <pic:cNvPr id="0" name="er-05-motor.png"/>
-                    <pic:cNvPicPr/>
-                  </pic:nvPicPr>
-                  <pic:blipFill>
-                    <a:blip r:embed="rId41"/>
-                    <a:stretch>
-                      <a:fillRect/>
-                    </a:stretch>
-                  </pic:blipFill>
-                  <pic:spPr>
-                    <a:xfrm>
-                      <a:off x="0" y="0"/>
-                      <a:ext cx="8963660" cy="2336306"/>
-                    </a:xfrm>
-                    <a:prstGeom prst="rect"/>
-                  </pic:spPr>
-                </pic:pic>
-              </a:graphicData>
-            </a:graphic>
-          </wp:inline>
-        </w:drawing>
-      </w:r>
-    </w:p>
-    <w:p>
-      <w:pPr>
-        <w:jc w:val="center"/>
-      </w:pPr>
-      <w:r>
-        <w:rPr>
-          <w:b/>
-          <w:color w:val="57534E"/>
-          <w:sz w:val="18"/>
-        </w:rPr>
-        <w:t xml:space="preserve">Figura 15. </w:t>
-      </w:r>
-      <w:r>
-        <w:rPr>
-          <w:color w:val="57534E"/>
-          <w:sz w:val="18"/>
-        </w:rPr>
-        <w:t>Modelo de datos del motor: sugerencias, remisiones con sus líneas y reportes de necesidad.</w:t>
-      </w:r>
-    </w:p>
-    <w:p>
-      <w:pPr>
-        <w:keepNext/>
-        <w:spacing w:after="40"/>
-        <w:jc w:val="center"/>
-      </w:pPr>
-      <w:r>
-        <w:drawing>
-          <wp:inline xmlns:a="http://schemas.openxmlformats.org/drawingml/2006/main" xmlns:pic="http://schemas.openxmlformats.org/drawingml/2006/picture">
-            <wp:extent cx="8963660" cy="4410971"/>
-            <wp:docPr id="16" name="Picture 16"/>
             <wp:cNvGraphicFramePr>
               <a:graphicFrameLocks noChangeAspect="1"/>
             </wp:cNvGraphicFramePr>
@@ -1486,7 +1541,7 @@
                     <pic:cNvPicPr/>
                   </pic:nvPicPr>
                   <pic:blipFill>
-                    <a:blip r:embed="rId42"/>
+                    <a:blip r:embed="rId40"/>
                     <a:stretch>
                       <a:fillRect/>
                     </a:stretch>
@@ -1515,7 +1570,7 @@
           <w:color w:val="57534E"/>
           <w:sz w:val="18"/>
         </w:rPr>
-        <w:t xml:space="preserve">Figura 16. </w:t>
+        <w:t xml:space="preserve">Figura 14. </w:t>
       </w:r>
       <w:r>
         <w:rPr>
@@ -1535,7 +1590,7 @@
         <w:drawing>
           <wp:inline xmlns:a="http://schemas.openxmlformats.org/drawingml/2006/main" xmlns:pic="http://schemas.openxmlformats.org/drawingml/2006/picture">
             <wp:extent cx="3664383" cy="4896374"/>
-            <wp:docPr id="17" name="Picture 17"/>
+            <wp:docPr id="15" name="Picture 15"/>
             <wp:cNvGraphicFramePr>
               <a:graphicFrameLocks noChangeAspect="1"/>
             </wp:cNvGraphicFramePr>
@@ -1547,7 +1602,7 @@
                     <pic:cNvPicPr/>
                   </pic:nvPicPr>
                   <pic:blipFill>
-                    <a:blip r:embed="rId43"/>
+                    <a:blip r:embed="rId41"/>
                     <a:stretch>
                       <a:fillRect/>
                     </a:stretch>
@@ -1576,7 +1631,7 @@
           <w:color w:val="57534E"/>
           <w:sz w:val="18"/>
         </w:rPr>
-        <w:t xml:space="preserve">Figura 17. </w:t>
+        <w:t xml:space="preserve">Figura 15. </w:t>
       </w:r>
       <w:r>
         <w:rPr>
@@ -6778,41 +6833,10 @@
         <w:t>¿Qué funcionó bien?</w:t>
       </w:r>
     </w:p>
-    <w:tbl>
-      <w:tblPr>
-        <w:tblStyle w:val="Tablaconcuadrcula"/>
-        <w:tblW w:type="auto" w:w="0"/>
-        <w:jc w:val="center"/>
-        <w:tblLook w:firstColumn="1" w:firstRow="1" w:lastColumn="0" w:lastRow="0" w:noHBand="0" w:noVBand="1" w:val="04A0"/>
-      </w:tblPr>
-      <w:tblGrid>
-        <w:gridCol w:w="9184"/>
-      </w:tblGrid>
-      <w:tr>
-        <w:tc>
-          <w:tcPr>
-            <w:tcW w:type="dxa" w:w="9184"/>
-            <w:shd w:val="clear" w:color="auto" w:fill="FFF4E5"/>
-          </w:tcPr>
-          <w:p>
-            <w:pPr>
-              <w:jc w:val="center"/>
-            </w:pPr>
-            <w:r>
-              <w:rPr>
-                <w:b/>
-                <w:sz w:val="18"/>
-              </w:rPr>
-              <w:t>Pendiente: la escribe Joseph.</w:t>
-            </w:r>
-          </w:p>
-        </w:tc>
-      </w:tr>
-    </w:tbl>
     <w:p>
-      <w:pPr>
-        <w:spacing w:after="40"/>
-      </w:pPr>
+      <w:r>
+        <w:t>El trabajo con Stitch. Con las maquetas aprobadas se construyen interfaces funcionales, y el flujo que se está usando (maqueta, especificación, plan, pull request y recorrido) es bastante bueno para avanzar y para analizar requerimientos nuevos y extras al aplicativo.</w:t>
+      </w:r>
     </w:p>
     <w:p>
       <w:r>
@@ -6822,41 +6846,10 @@
         <w:t>¿Qué no funcionó o dificultó el trabajo?</w:t>
       </w:r>
     </w:p>
-    <w:tbl>
-      <w:tblPr>
-        <w:tblStyle w:val="Tablaconcuadrcula"/>
-        <w:tblW w:type="auto" w:w="0"/>
-        <w:jc w:val="center"/>
-        <w:tblLook w:firstColumn="1" w:firstRow="1" w:lastColumn="0" w:lastRow="0" w:noHBand="0" w:noVBand="1" w:val="04A0"/>
-      </w:tblPr>
-      <w:tblGrid>
-        <w:gridCol w:w="9184"/>
-      </w:tblGrid>
-      <w:tr>
-        <w:tc>
-          <w:tcPr>
-            <w:tcW w:type="dxa" w:w="9184"/>
-            <w:shd w:val="clear" w:color="auto" w:fill="FFF4E5"/>
-          </w:tcPr>
-          <w:p>
-            <w:pPr>
-              <w:jc w:val="center"/>
-            </w:pPr>
-            <w:r>
-              <w:rPr>
-                <w:b/>
-                <w:sz w:val="18"/>
-              </w:rPr>
-              <w:t>Pendiente: la escribe Joseph.</w:t>
-            </w:r>
-          </w:p>
-        </w:tc>
-      </w:tr>
-    </w:tbl>
     <w:p>
-      <w:pPr>
-        <w:spacing w:after="40"/>
-      </w:pPr>
+      <w:r>
+        <w:t>Con el tiempo se dificultó crear la lógica del envío de correos sin poder probarla, porque el SMTP todavía no se ha configurado. Pasa lo mismo con otros apartados que no han tenido pruebas reales durante el desarrollo.</w:t>
+      </w:r>
     </w:p>
     <w:p>
       <w:r>
@@ -6866,41 +6859,10 @@
         <w:t>¿Qué aprendimos?</w:t>
       </w:r>
     </w:p>
-    <w:tbl>
-      <w:tblPr>
-        <w:tblStyle w:val="Tablaconcuadrcula"/>
-        <w:tblW w:type="auto" w:w="0"/>
-        <w:jc w:val="center"/>
-        <w:tblLook w:firstColumn="1" w:firstRow="1" w:lastColumn="0" w:lastRow="0" w:noHBand="0" w:noVBand="1" w:val="04A0"/>
-      </w:tblPr>
-      <w:tblGrid>
-        <w:gridCol w:w="9184"/>
-      </w:tblGrid>
-      <w:tr>
-        <w:tc>
-          <w:tcPr>
-            <w:tcW w:type="dxa" w:w="9184"/>
-            <w:shd w:val="clear" w:color="auto" w:fill="FFF4E5"/>
-          </w:tcPr>
-          <w:p>
-            <w:pPr>
-              <w:jc w:val="center"/>
-            </w:pPr>
-            <w:r>
-              <w:rPr>
-                <w:b/>
-                <w:sz w:val="18"/>
-              </w:rPr>
-              <w:t>Pendiente: la escribe Joseph.</w:t>
-            </w:r>
-          </w:p>
-        </w:tc>
-      </w:tr>
-    </w:tbl>
     <w:p>
-      <w:pPr>
-        <w:spacing w:after="40"/>
-      </w:pPr>
+      <w:r>
+        <w:t>Aprendimos a usar un gestor de contenido S3 (Garage), que puede albergar bastante información. Sin él, almacenar ese contenido habría sido pesado para el servidor.</w:t>
+      </w:r>
     </w:p>
     <w:p>
       <w:r>
@@ -6910,41 +6872,16 @@
         <w:t>¿Qué acción concreta aplicaremos en el siguiente corte?</w:t>
       </w:r>
     </w:p>
-    <w:tbl>
-      <w:tblPr>
-        <w:tblStyle w:val="Tablaconcuadrcula"/>
-        <w:tblW w:type="auto" w:w="0"/>
-        <w:jc w:val="center"/>
-        <w:tblLook w:firstColumn="1" w:firstRow="1" w:lastColumn="0" w:lastRow="0" w:noHBand="0" w:noVBand="1" w:val="04A0"/>
-      </w:tblPr>
-      <w:tblGrid>
-        <w:gridCol w:w="9184"/>
-      </w:tblGrid>
-      <w:tr>
-        <w:tc>
-          <w:tcPr>
-            <w:tcW w:type="dxa" w:w="9184"/>
-            <w:shd w:val="clear" w:color="auto" w:fill="FFF4E5"/>
-          </w:tcPr>
-          <w:p>
-            <w:pPr>
-              <w:jc w:val="center"/>
-            </w:pPr>
-            <w:r>
-              <w:rPr>
-                <w:b/>
-                <w:sz w:val="18"/>
-              </w:rPr>
-              <w:t>Pendiente: la escribe Joseph. Tiene que ser una acción verificable.</w:t>
-            </w:r>
-          </w:p>
-        </w:tc>
-      </w:tr>
-    </w:tbl>
     <w:p>
-      <w:pPr>
-        <w:spacing w:after="40"/>
-      </w:pPr>
+      <w:r>
+        <w:t>Continuar con el mínimo viable y cargar la información del aplicativo original de Acopio Bogotá (RedAcopio), obtenida por scraping, por tandas y sin sobrecargar el servidor de terceros. Se verifica cuando el importador de la pieza E (</w:t>
+      </w:r>
+      <w:r>
+        <w:t>#49</w:t>
+      </w:r>
+      <w:r>
+        <w:t>) haya cargado esos acopios en el servidor de pruebas, antes del 15 de noviembre.</w:t>
+      </w:r>
     </w:p>
     <w:p>
       <w:pPr>

</xml_diff>

<commit_message>
Avance 5: capturas de los recorridos, P-073 resuelto e informe
Co-Authored-By: Claude Opus 5.5 <noreply@anthropic.com>
</commit_message>
<xml_diff>
--- a/docs/entregas/Avance 5 - Sprint 2 - Acopio.docx
+++ b/docs/entregas/Avance 5 - Sprint 2 - Acopio.docx
@@ -335,7 +335,7 @@
     </w:p>
     <w:p>
       <w:r>
-        <w:t>Las pantallas de abajo corresponden a las historias del Planning del Sprint 2. Las capturas son de la demo del servidor de pruebas, con datos de la base, a 390 px de ancho, el tamaño de un teléfono.</w:t>
+        <w:t>Las pantallas de abajo corresponden a las historias del Planning del Sprint 2. Las capturas las toman los recorridos de punta a punta mientras recorren cada flujo en un navegador real, con datos de la base de la demo, a 360 px de ancho, el tamaño de un teléfono.</w:t>
       </w:r>
     </w:p>
     <w:p>
@@ -423,6 +423,9 @@
       </w:r>
     </w:p>
     <w:p>
+      <w:pPr>
+        <w:keepNext/>
+      </w:pPr>
       <w:r>
         <w:t>HU-13 Contar lo que la fórmula no ve se cubre desde «Mi zona»: el Receptor reporta una necesidad que el cálculo no conoce, y el motor la toma en cuenta al recalcular.</w:t>
       </w:r>
@@ -453,7 +456,7 @@
             <w:r>
               <w:drawing>
                 <wp:inline xmlns:a="http://schemas.openxmlformats.org/drawingml/2006/main" xmlns:pic="http://schemas.openxmlformats.org/drawingml/2006/picture">
-                  <wp:extent cx="1655946" cy="3583637"/>
+                  <wp:extent cx="1655946" cy="2943904"/>
                   <wp:docPr id="1" name="Picture 1"/>
                   <wp:cNvGraphicFramePr>
                     <a:graphicFrameLocks noChangeAspect="1"/>
@@ -462,7 +465,7 @@
                     <a:graphicData uri="http://schemas.openxmlformats.org/drawingml/2006/picture">
                       <pic:pic>
                         <pic:nvPicPr>
-                          <pic:cNvPr id="0" name="c11-motor.png"/>
+                          <pic:cNvPr id="0" name="motor-1-sugerencias.png"/>
                           <pic:cNvPicPr/>
                         </pic:nvPicPr>
                         <pic:blipFill>
@@ -474,7 +477,7 @@
                         <pic:spPr>
                           <a:xfrm>
                             <a:off x="0" y="0"/>
-                            <a:ext cx="1655946" cy="3583637"/>
+                            <a:ext cx="1655946" cy="2943904"/>
                           </a:xfrm>
                           <a:prstGeom prst="rect"/>
                         </pic:spPr>
@@ -517,7 +520,7 @@
             <w:r>
               <w:drawing>
                 <wp:inline xmlns:a="http://schemas.openxmlformats.org/drawingml/2006/main" xmlns:pic="http://schemas.openxmlformats.org/drawingml/2006/picture">
-                  <wp:extent cx="1655946" cy="3583637"/>
+                  <wp:extent cx="1655946" cy="2943904"/>
                   <wp:docPr id="2" name="Picture 2"/>
                   <wp:cNvGraphicFramePr>
                     <a:graphicFrameLocks noChangeAspect="1"/>
@@ -526,7 +529,7 @@
                     <a:graphicData uri="http://schemas.openxmlformats.org/drawingml/2006/picture">
                       <pic:pic>
                         <pic:nvPicPr>
-                          <pic:cNvPr id="0" name="c12-remisiones.png"/>
+                          <pic:cNvPr id="0" name="motor-2-aprobar.png"/>
                           <pic:cNvPicPr/>
                         </pic:nvPicPr>
                         <pic:blipFill>
@@ -538,7 +541,7 @@
                         <pic:spPr>
                           <a:xfrm>
                             <a:off x="0" y="0"/>
-                            <a:ext cx="1655946" cy="3583637"/>
+                            <a:ext cx="1655946" cy="2943904"/>
                           </a:xfrm>
                           <a:prstGeom prst="rect"/>
                         </pic:spPr>
@@ -566,7 +569,7 @@
                 <w:color w:val="57534E"/>
                 <w:sz w:val="16"/>
               </w:rPr>
-              <w:t>Remisiones (C12): la remisión en borrador, lista para despachar.</w:t>
+              <w:t>Aprobar un traslado: la cantidad sugerida y la remisión en borrador que se crea.</w:t>
             </w:r>
           </w:p>
         </w:tc>
@@ -581,7 +584,7 @@
             <w:r>
               <w:drawing>
                 <wp:inline xmlns:a="http://schemas.openxmlformats.org/drawingml/2006/main" xmlns:pic="http://schemas.openxmlformats.org/drawingml/2006/picture">
-                  <wp:extent cx="1655946" cy="3495886"/>
+                  <wp:extent cx="1655946" cy="2943904"/>
                   <wp:docPr id="3" name="Picture 3"/>
                   <wp:cNvGraphicFramePr>
                     <a:graphicFrameLocks noChangeAspect="1"/>
@@ -590,7 +593,7 @@
                     <a:graphicData uri="http://schemas.openxmlformats.org/drawingml/2006/picture">
                       <pic:pic>
                         <pic:nvPicPr>
-                          <pic:cNvPr id="0" name="c12-documento.png"/>
+                          <pic:cNvPr id="0" name="motor-3-despachar.png"/>
                           <pic:cNvPicPr/>
                         </pic:nvPicPr>
                         <pic:blipFill>
@@ -602,7 +605,7 @@
                         <pic:spPr>
                           <a:xfrm>
                             <a:off x="0" y="0"/>
-                            <a:ext cx="1655946" cy="3495886"/>
+                            <a:ext cx="1655946" cy="2943904"/>
                           </a:xfrm>
                           <a:prstGeom prst="rect"/>
                         </pic:spPr>
@@ -630,7 +633,7 @@
                 <w:color w:val="57534E"/>
                 <w:sz w:val="16"/>
               </w:rPr>
-              <w:t>Documento de una remisión despachada, con su QR.</w:t>
+              <w:t>Despachar la remisión (C12): quién lleva el envío y qué folios van.</w:t>
             </w:r>
           </w:p>
         </w:tc>
@@ -676,7 +679,7 @@
                     <a:graphicData uri="http://schemas.openxmlformats.org/drawingml/2006/picture">
                       <pic:pic>
                         <pic:nvPicPr>
-                          <pic:cNvPr id="0" name="c13-recibida.png"/>
+                          <pic:cNvPr id="0" name="motor-4-documento.png"/>
                           <pic:cNvPicPr/>
                         </pic:nvPicPr>
                         <pic:blipFill>
@@ -716,7 +719,7 @@
                 <w:color w:val="57534E"/>
                 <w:sz w:val="16"/>
               </w:rPr>
-              <w:t>Recepción en la zona (C13): confirmación de una remisión recibida.</w:t>
+              <w:t>Documento de la remisión despachada, con su QR.</w:t>
             </w:r>
           </w:p>
         </w:tc>
@@ -724,13 +727,129 @@
           <w:tcPr>
             <w:tcW w:type="dxa" w:w="3061"/>
           </w:tcPr>
-          <w:p/>
+          <w:p>
+            <w:pPr>
+              <w:jc w:val="center"/>
+            </w:pPr>
+            <w:r>
+              <w:drawing>
+                <wp:inline xmlns:a="http://schemas.openxmlformats.org/drawingml/2006/main" xmlns:pic="http://schemas.openxmlformats.org/drawingml/2006/picture">
+                  <wp:extent cx="1655946" cy="2943904"/>
+                  <wp:docPr id="5" name="Picture 5"/>
+                  <wp:cNvGraphicFramePr>
+                    <a:graphicFrameLocks noChangeAspect="1"/>
+                  </wp:cNvGraphicFramePr>
+                  <a:graphic>
+                    <a:graphicData uri="http://schemas.openxmlformats.org/drawingml/2006/picture">
+                      <pic:pic>
+                        <pic:nvPicPr>
+                          <pic:cNvPr id="0" name="motor-5-recibir.png"/>
+                          <pic:cNvPicPr/>
+                        </pic:nvPicPr>
+                        <pic:blipFill>
+                          <a:blip r:embed="rId31"/>
+                          <a:stretch>
+                            <a:fillRect/>
+                          </a:stretch>
+                        </pic:blipFill>
+                        <pic:spPr>
+                          <a:xfrm>
+                            <a:off x="0" y="0"/>
+                            <a:ext cx="1655946" cy="2943904"/>
+                          </a:xfrm>
+                          <a:prstGeom prst="rect"/>
+                        </pic:spPr>
+                      </pic:pic>
+                    </a:graphicData>
+                  </a:graphic>
+                </wp:inline>
+              </w:drawing>
+            </w:r>
+          </w:p>
+          <w:p>
+            <w:pPr>
+              <w:jc w:val="center"/>
+            </w:pPr>
+            <w:r>
+              <w:rPr>
+                <w:b/>
+                <w:color w:val="57534E"/>
+                <w:sz w:val="16"/>
+              </w:rPr>
+              <w:t xml:space="preserve">Figura 5. </w:t>
+            </w:r>
+            <w:r>
+              <w:rPr>
+                <w:color w:val="57534E"/>
+                <w:sz w:val="16"/>
+              </w:rPr>
+              <w:t>Recibir en la zona (C13): lo que llegó, la foto y la nota.</w:t>
+            </w:r>
+          </w:p>
         </w:tc>
         <w:tc>
           <w:tcPr>
             <w:tcW w:type="dxa" w:w="3061"/>
           </w:tcPr>
-          <w:p/>
+          <w:p>
+            <w:pPr>
+              <w:jc w:val="center"/>
+            </w:pPr>
+            <w:r>
+              <w:drawing>
+                <wp:inline xmlns:a="http://schemas.openxmlformats.org/drawingml/2006/main" xmlns:pic="http://schemas.openxmlformats.org/drawingml/2006/picture">
+                  <wp:extent cx="1655946" cy="2943904"/>
+                  <wp:docPr id="6" name="Picture 6"/>
+                  <wp:cNvGraphicFramePr>
+                    <a:graphicFrameLocks noChangeAspect="1"/>
+                  </wp:cNvGraphicFramePr>
+                  <a:graphic>
+                    <a:graphicData uri="http://schemas.openxmlformats.org/drawingml/2006/picture">
+                      <pic:pic>
+                        <pic:nvPicPr>
+                          <pic:cNvPr id="0" name="motor-6-recibida.png"/>
+                          <pic:cNvPicPr/>
+                        </pic:nvPicPr>
+                        <pic:blipFill>
+                          <a:blip r:embed="rId32"/>
+                          <a:stretch>
+                            <a:fillRect/>
+                          </a:stretch>
+                        </pic:blipFill>
+                        <pic:spPr>
+                          <a:xfrm>
+                            <a:off x="0" y="0"/>
+                            <a:ext cx="1655946" cy="2943904"/>
+                          </a:xfrm>
+                          <a:prstGeom prst="rect"/>
+                        </pic:spPr>
+                      </pic:pic>
+                    </a:graphicData>
+                  </a:graphic>
+                </wp:inline>
+              </w:drawing>
+            </w:r>
+          </w:p>
+          <w:p>
+            <w:pPr>
+              <w:jc w:val="center"/>
+            </w:pPr>
+            <w:r>
+              <w:rPr>
+                <w:b/>
+                <w:color w:val="57534E"/>
+                <w:sz w:val="16"/>
+              </w:rPr>
+              <w:t xml:space="preserve">Figura 6. </w:t>
+            </w:r>
+            <w:r>
+              <w:rPr>
+                <w:color w:val="57534E"/>
+                <w:sz w:val="16"/>
+              </w:rPr>
+              <w:t>Confirmación de la remisión recibida.</w:t>
+            </w:r>
+          </w:p>
         </w:tc>
       </w:tr>
     </w:tbl>
@@ -806,6 +925,7 @@
     <w:p>
       <w:pPr>
         <w:pStyle w:val="Vineta"/>
+        <w:keepNext/>
       </w:pPr>
       <w:r>
         <w:t xml:space="preserve">4. </w:t>
@@ -840,8 +960,8 @@
             <w:r>
               <w:drawing>
                 <wp:inline xmlns:a="http://schemas.openxmlformats.org/drawingml/2006/main" xmlns:pic="http://schemas.openxmlformats.org/drawingml/2006/picture">
-                  <wp:extent cx="1655946" cy="3583637"/>
-                  <wp:docPr id="5" name="Picture 5"/>
+                  <wp:extent cx="1655946" cy="2943904"/>
+                  <wp:docPr id="7" name="Picture 7"/>
                   <wp:cNvGraphicFramePr>
                     <a:graphicFrameLocks noChangeAspect="1"/>
                   </wp:cNvGraphicFramePr>
@@ -849,11 +969,455 @@
                     <a:graphicData uri="http://schemas.openxmlformats.org/drawingml/2006/picture">
                       <pic:pic>
                         <pic:nvPicPr>
-                          <pic:cNvPr id="0" name="p03-causas.png"/>
+                          <pic:cNvPr id="0" name="causas-1-directorio.png"/>
                           <pic:cNvPicPr/>
                         </pic:nvPicPr>
                         <pic:blipFill>
-                          <a:blip r:embed="rId31"/>
+                          <a:blip r:embed="rId33"/>
+                          <a:stretch>
+                            <a:fillRect/>
+                          </a:stretch>
+                        </pic:blipFill>
+                        <pic:spPr>
+                          <a:xfrm>
+                            <a:off x="0" y="0"/>
+                            <a:ext cx="1655946" cy="2943904"/>
+                          </a:xfrm>
+                          <a:prstGeom prst="rect"/>
+                        </pic:spPr>
+                      </pic:pic>
+                    </a:graphicData>
+                  </a:graphic>
+                </wp:inline>
+              </w:drawing>
+            </w:r>
+          </w:p>
+          <w:p>
+            <w:pPr>
+              <w:jc w:val="center"/>
+            </w:pPr>
+            <w:r>
+              <w:rPr>
+                <w:b/>
+                <w:color w:val="57534E"/>
+                <w:sz w:val="16"/>
+              </w:rPr>
+              <w:t xml:space="preserve">Figura 7. </w:t>
+            </w:r>
+            <w:r>
+              <w:rPr>
+                <w:color w:val="57534E"/>
+                <w:sz w:val="16"/>
+              </w:rPr>
+              <w:t>Directorio de causas (P3), solo de entidades verificadas.</w:t>
+            </w:r>
+          </w:p>
+        </w:tc>
+        <w:tc>
+          <w:tcPr>
+            <w:tcW w:type="dxa" w:w="3061"/>
+          </w:tcPr>
+          <w:p>
+            <w:pPr>
+              <w:jc w:val="center"/>
+            </w:pPr>
+            <w:r>
+              <w:drawing>
+                <wp:inline xmlns:a="http://schemas.openxmlformats.org/drawingml/2006/main" xmlns:pic="http://schemas.openxmlformats.org/drawingml/2006/picture">
+                  <wp:extent cx="1655946" cy="2943904"/>
+                  <wp:docPr id="8" name="Picture 8"/>
+                  <wp:cNvGraphicFramePr>
+                    <a:graphicFrameLocks noChangeAspect="1"/>
+                  </wp:cNvGraphicFramePr>
+                  <a:graphic>
+                    <a:graphicData uri="http://schemas.openxmlformats.org/drawingml/2006/picture">
+                      <pic:pic>
+                        <pic:nvPicPr>
+                          <pic:cNvPr id="0" name="causas-2-ficha.png"/>
+                          <pic:cNvPicPr/>
+                        </pic:nvPicPr>
+                        <pic:blipFill>
+                          <a:blip r:embed="rId34"/>
+                          <a:stretch>
+                            <a:fillRect/>
+                          </a:stretch>
+                        </pic:blipFill>
+                        <pic:spPr>
+                          <a:xfrm>
+                            <a:off x="0" y="0"/>
+                            <a:ext cx="1655946" cy="2943904"/>
+                          </a:xfrm>
+                          <a:prstGeom prst="rect"/>
+                        </pic:spPr>
+                      </pic:pic>
+                    </a:graphicData>
+                  </a:graphic>
+                </wp:inline>
+              </w:drawing>
+            </w:r>
+          </w:p>
+          <w:p>
+            <w:pPr>
+              <w:jc w:val="center"/>
+            </w:pPr>
+            <w:r>
+              <w:rPr>
+                <w:b/>
+                <w:color w:val="57534E"/>
+                <w:sz w:val="16"/>
+              </w:rPr>
+              <w:t xml:space="preserve">Figura 8. </w:t>
+            </w:r>
+            <w:r>
+              <w:rPr>
+                <w:color w:val="57534E"/>
+                <w:sz w:val="16"/>
+              </w:rPr>
+              <w:t>Ficha de una causa (P4), con su imagen, la entidad y el paso a paso.</w:t>
+            </w:r>
+          </w:p>
+        </w:tc>
+        <w:tc>
+          <w:tcPr>
+            <w:tcW w:type="dxa" w:w="3061"/>
+          </w:tcPr>
+          <w:p>
+            <w:pPr>
+              <w:jc w:val="center"/>
+            </w:pPr>
+            <w:r>
+              <w:drawing>
+                <wp:inline xmlns:a="http://schemas.openxmlformats.org/drawingml/2006/main" xmlns:pic="http://schemas.openxmlformats.org/drawingml/2006/picture">
+                  <wp:extent cx="1655946" cy="2943904"/>
+                  <wp:docPr id="9" name="Picture 9"/>
+                  <wp:cNvGraphicFramePr>
+                    <a:graphicFrameLocks noChangeAspect="1"/>
+                  </wp:cNvGraphicFramePr>
+                  <a:graphic>
+                    <a:graphicData uri="http://schemas.openxmlformats.org/drawingml/2006/picture">
+                      <pic:pic>
+                        <pic:nvPicPr>
+                          <pic:cNvPr id="0" name="causas-3-salida.png"/>
+                          <pic:cNvPicPr/>
+                        </pic:nvPicPr>
+                        <pic:blipFill>
+                          <a:blip r:embed="rId35"/>
+                          <a:stretch>
+                            <a:fillRect/>
+                          </a:stretch>
+                        </pic:blipFill>
+                        <pic:spPr>
+                          <a:xfrm>
+                            <a:off x="0" y="0"/>
+                            <a:ext cx="1655946" cy="2943904"/>
+                          </a:xfrm>
+                          <a:prstGeom prst="rect"/>
+                        </pic:spPr>
+                      </pic:pic>
+                    </a:graphicData>
+                  </a:graphic>
+                </wp:inline>
+              </w:drawing>
+            </w:r>
+          </w:p>
+          <w:p>
+            <w:pPr>
+              <w:jc w:val="center"/>
+            </w:pPr>
+            <w:r>
+              <w:rPr>
+                <w:b/>
+                <w:color w:val="57534E"/>
+                <w:sz w:val="16"/>
+              </w:rPr>
+              <w:t xml:space="preserve">Figura 9. </w:t>
+            </w:r>
+            <w:r>
+              <w:rPr>
+                <w:color w:val="57534E"/>
+                <w:sz w:val="16"/>
+              </w:rPr>
+              <w:t>Aviso antes de salir al sitio oficial de la entidad.</w:t>
+            </w:r>
+          </w:p>
+        </w:tc>
+      </w:tr>
+    </w:tbl>
+    <w:p>
+      <w:pPr>
+        <w:spacing w:after="80"/>
+      </w:pPr>
+    </w:p>
+    <w:tbl>
+      <w:tblPr>
+        <w:tblW w:type="auto" w:w="0"/>
+        <w:jc w:val="center"/>
+        <w:tblLook w:firstColumn="1" w:firstRow="1" w:lastColumn="0" w:lastRow="0" w:noHBand="0" w:noVBand="1" w:val="04A0"/>
+      </w:tblPr>
+      <w:tblGrid>
+        <w:gridCol w:w="3061"/>
+        <w:gridCol w:w="3061"/>
+        <w:gridCol w:w="3061"/>
+      </w:tblGrid>
+      <w:tr>
+        <w:trPr>
+          <w:cantSplit w:val="true"/>
+        </w:trPr>
+        <w:tc>
+          <w:tcPr>
+            <w:tcW w:type="dxa" w:w="3061"/>
+          </w:tcPr>
+          <w:p>
+            <w:pPr>
+              <w:jc w:val="center"/>
+            </w:pPr>
+            <w:r>
+              <w:drawing>
+                <wp:inline xmlns:a="http://schemas.openxmlformats.org/drawingml/2006/main" xmlns:pic="http://schemas.openxmlformats.org/drawingml/2006/picture">
+                  <wp:extent cx="1655946" cy="2943904"/>
+                  <wp:docPr id="10" name="Picture 10"/>
+                  <wp:cNvGraphicFramePr>
+                    <a:graphicFrameLocks noChangeAspect="1"/>
+                  </wp:cNvGraphicFramePr>
+                  <a:graphic>
+                    <a:graphicData uri="http://schemas.openxmlformats.org/drawingml/2006/picture">
+                      <pic:pic>
+                        <pic:nvPicPr>
+                          <pic:cNvPr id="0" name="causas-4-verificar.png"/>
+                          <pic:cNvPicPr/>
+                        </pic:nvPicPr>
+                        <pic:blipFill>
+                          <a:blip r:embed="rId36"/>
+                          <a:stretch>
+                            <a:fillRect/>
+                          </a:stretch>
+                        </pic:blipFill>
+                        <pic:spPr>
+                          <a:xfrm>
+                            <a:off x="0" y="0"/>
+                            <a:ext cx="1655946" cy="2943904"/>
+                          </a:xfrm>
+                          <a:prstGeom prst="rect"/>
+                        </pic:spPr>
+                      </pic:pic>
+                    </a:graphicData>
+                  </a:graphic>
+                </wp:inline>
+              </w:drawing>
+            </w:r>
+          </w:p>
+          <w:p>
+            <w:pPr>
+              <w:jc w:val="center"/>
+            </w:pPr>
+            <w:r>
+              <w:rPr>
+                <w:b/>
+                <w:color w:val="57534E"/>
+                <w:sz w:val="16"/>
+              </w:rPr>
+              <w:t xml:space="preserve">Figura 10. </w:t>
+            </w:r>
+            <w:r>
+              <w:rPr>
+                <w:color w:val="57534E"/>
+                <w:sz w:val="16"/>
+              </w:rPr>
+              <w:t>Verificar una entidad (C15): el botón se activa al marcar la casilla del aviso.</w:t>
+            </w:r>
+          </w:p>
+        </w:tc>
+        <w:tc>
+          <w:tcPr>
+            <w:tcW w:type="dxa" w:w="3061"/>
+          </w:tcPr>
+          <w:p>
+            <w:pPr>
+              <w:jc w:val="center"/>
+            </w:pPr>
+            <w:r>
+              <w:drawing>
+                <wp:inline xmlns:a="http://schemas.openxmlformats.org/drawingml/2006/main" xmlns:pic="http://schemas.openxmlformats.org/drawingml/2006/picture">
+                  <wp:extent cx="1655946" cy="2943904"/>
+                  <wp:docPr id="11" name="Picture 11"/>
+                  <wp:cNvGraphicFramePr>
+                    <a:graphicFrameLocks noChangeAspect="1"/>
+                  </wp:cNvGraphicFramePr>
+                  <a:graphic>
+                    <a:graphicData uri="http://schemas.openxmlformats.org/drawingml/2006/picture">
+                      <pic:pic>
+                        <pic:nvPicPr>
+                          <pic:cNvPr id="0" name="causas-5-publicar.png"/>
+                          <pic:cNvPicPr/>
+                        </pic:nvPicPr>
+                        <pic:blipFill>
+                          <a:blip r:embed="rId37"/>
+                          <a:stretch>
+                            <a:fillRect/>
+                          </a:stretch>
+                        </pic:blipFill>
+                        <pic:spPr>
+                          <a:xfrm>
+                            <a:off x="0" y="0"/>
+                            <a:ext cx="1655946" cy="2943904"/>
+                          </a:xfrm>
+                          <a:prstGeom prst="rect"/>
+                        </pic:spPr>
+                      </pic:pic>
+                    </a:graphicData>
+                  </a:graphic>
+                </wp:inline>
+              </w:drawing>
+            </w:r>
+          </w:p>
+          <w:p>
+            <w:pPr>
+              <w:jc w:val="center"/>
+            </w:pPr>
+            <w:r>
+              <w:rPr>
+                <w:b/>
+                <w:color w:val="57534E"/>
+                <w:sz w:val="16"/>
+              </w:rPr>
+              <w:t xml:space="preserve">Figura 11. </w:t>
+            </w:r>
+            <w:r>
+              <w:rPr>
+                <w:color w:val="57534E"/>
+                <w:sz w:val="16"/>
+              </w:rPr>
+              <w:t>Publicar una causa (C22): paso a paso, enlace oficial y fecha de cierre.</w:t>
+            </w:r>
+          </w:p>
+        </w:tc>
+        <w:tc>
+          <w:tcPr>
+            <w:tcW w:type="dxa" w:w="3061"/>
+          </w:tcPr>
+          <w:p>
+            <w:pPr>
+              <w:jc w:val="center"/>
+            </w:pPr>
+            <w:r>
+              <w:drawing>
+                <wp:inline xmlns:a="http://schemas.openxmlformats.org/drawingml/2006/main" xmlns:pic="http://schemas.openxmlformats.org/drawingml/2006/picture">
+                  <wp:extent cx="1655946" cy="2943904"/>
+                  <wp:docPr id="12" name="Picture 12"/>
+                  <wp:cNvGraphicFramePr>
+                    <a:graphicFrameLocks noChangeAspect="1"/>
+                  </wp:cNvGraphicFramePr>
+                  <a:graphic>
+                    <a:graphicData uri="http://schemas.openxmlformats.org/drawingml/2006/picture">
+                      <pic:pic>
+                        <pic:nvPicPr>
+                          <pic:cNvPr id="0" name="causas-6-sin-verificar.png"/>
+                          <pic:cNvPicPr/>
+                        </pic:nvPicPr>
+                        <pic:blipFill>
+                          <a:blip r:embed="rId38"/>
+                          <a:stretch>
+                            <a:fillRect/>
+                          </a:stretch>
+                        </pic:blipFill>
+                        <pic:spPr>
+                          <a:xfrm>
+                            <a:off x="0" y="0"/>
+                            <a:ext cx="1655946" cy="2943904"/>
+                          </a:xfrm>
+                          <a:prstGeom prst="rect"/>
+                        </pic:spPr>
+                      </pic:pic>
+                    </a:graphicData>
+                  </a:graphic>
+                </wp:inline>
+              </w:drawing>
+            </w:r>
+          </w:p>
+          <w:p>
+            <w:pPr>
+              <w:jc w:val="center"/>
+            </w:pPr>
+            <w:r>
+              <w:rPr>
+                <w:b/>
+                <w:color w:val="57534E"/>
+                <w:sz w:val="16"/>
+              </w:rPr>
+              <w:t xml:space="preserve">Figura 12. </w:t>
+            </w:r>
+            <w:r>
+              <w:rPr>
+                <w:color w:val="57534E"/>
+                <w:sz w:val="16"/>
+              </w:rPr>
+              <w:t>Ficha de una causa cuya entidad perdió la verificación: sin sello ni enlace.</w:t>
+            </w:r>
+          </w:p>
+        </w:tc>
+      </w:tr>
+    </w:tbl>
+    <w:p>
+      <w:pPr>
+        <w:spacing w:after="80"/>
+      </w:pPr>
+    </w:p>
+    <w:p>
+      <w:pPr>
+        <w:pStyle w:val="Ttulo2"/>
+      </w:pPr>
+      <w:r>
+        <w:t>1c. Otras pantallas del incremento</w:t>
+      </w:r>
+    </w:p>
+    <w:p>
+      <w:pPr>
+        <w:keepNext/>
+      </w:pPr>
+      <w:r>
+        <w:t>El incremento tiene más pantallas que las de los dos flujos. Estas también leen la base de la demo; la portada ya muestra el balance de recepción con datos de inventario.</w:t>
+      </w:r>
+    </w:p>
+    <w:tbl>
+      <w:tblPr>
+        <w:tblW w:type="auto" w:w="0"/>
+        <w:jc w:val="center"/>
+        <w:tblLook w:firstColumn="1" w:firstRow="1" w:lastColumn="0" w:lastRow="0" w:noHBand="0" w:noVBand="1" w:val="04A0"/>
+      </w:tblPr>
+      <w:tblGrid>
+        <w:gridCol w:w="3061"/>
+        <w:gridCol w:w="3061"/>
+        <w:gridCol w:w="3061"/>
+      </w:tblGrid>
+      <w:tr>
+        <w:trPr>
+          <w:cantSplit w:val="true"/>
+        </w:trPr>
+        <w:tc>
+          <w:tcPr>
+            <w:tcW w:type="dxa" w:w="3061"/>
+          </w:tcPr>
+          <w:p>
+            <w:pPr>
+              <w:jc w:val="center"/>
+            </w:pPr>
+            <w:r>
+              <w:drawing>
+                <wp:inline xmlns:a="http://schemas.openxmlformats.org/drawingml/2006/main" xmlns:pic="http://schemas.openxmlformats.org/drawingml/2006/picture">
+                  <wp:extent cx="1655946" cy="3583637"/>
+                  <wp:docPr id="13" name="Picture 13"/>
+                  <wp:cNvGraphicFramePr>
+                    <a:graphicFrameLocks noChangeAspect="1"/>
+                  </wp:cNvGraphicFramePr>
+                  <a:graphic>
+                    <a:graphicData uri="http://schemas.openxmlformats.org/drawingml/2006/picture">
+                      <pic:pic>
+                        <pic:nvPicPr>
+                          <pic:cNvPr id="0" name="portada-balance.png"/>
+                          <pic:cNvPicPr/>
+                        </pic:nvPicPr>
+                        <pic:blipFill>
+                          <a:blip r:embed="rId39"/>
                           <a:stretch>
                             <a:fillRect/>
                           </a:stretch>
@@ -882,14 +1446,14 @@
                 <w:color w:val="57534E"/>
                 <w:sz w:val="16"/>
               </w:rPr>
-              <w:t xml:space="preserve">Figura 5. </w:t>
+              <w:t xml:space="preserve">Figura 13. </w:t>
             </w:r>
             <w:r>
               <w:rPr>
                 <w:color w:val="57534E"/>
                 <w:sz w:val="16"/>
               </w:rPr>
-              <w:t>Directorio de causas (P3).</w:t>
+              <w:t>Portada (P1): el balance dice qué hace falta y qué no traer.</w:t>
             </w:r>
           </w:p>
         </w:tc>
@@ -904,8 +1468,8 @@
             <w:r>
               <w:drawing>
                 <wp:inline xmlns:a="http://schemas.openxmlformats.org/drawingml/2006/main" xmlns:pic="http://schemas.openxmlformats.org/drawingml/2006/picture">
-                  <wp:extent cx="1655946" cy="3583637"/>
-                  <wp:docPr id="6" name="Picture 6"/>
+                  <wp:extent cx="1655946" cy="2943904"/>
+                  <wp:docPr id="14" name="Picture 14"/>
                   <wp:cNvGraphicFramePr>
                     <a:graphicFrameLocks noChangeAspect="1"/>
                   </wp:cNvGraphicFramePr>
@@ -913,11 +1477,11 @@
                     <a:graphicData uri="http://schemas.openxmlformats.org/drawingml/2006/picture">
                       <pic:pic>
                         <pic:nvPicPr>
-                          <pic:cNvPr id="0" name="p04-ficha-causa.png"/>
+                          <pic:cNvPr id="0" name="otras-mapa-zona.png"/>
                           <pic:cNvPicPr/>
                         </pic:nvPicPr>
                         <pic:blipFill>
-                          <a:blip r:embed="rId32"/>
+                          <a:blip r:embed="rId40"/>
                           <a:stretch>
                             <a:fillRect/>
                           </a:stretch>
@@ -925,7 +1489,7 @@
                         <pic:spPr>
                           <a:xfrm>
                             <a:off x="0" y="0"/>
-                            <a:ext cx="1655946" cy="3583637"/>
+                            <a:ext cx="1655946" cy="2943904"/>
                           </a:xfrm>
                           <a:prstGeom prst="rect"/>
                         </pic:spPr>
@@ -946,14 +1510,14 @@
                 <w:color w:val="57534E"/>
                 <w:sz w:val="16"/>
               </w:rPr>
-              <w:t xml:space="preserve">Figura 6. </w:t>
+              <w:t xml:space="preserve">Figura 14. </w:t>
             </w:r>
             <w:r>
               <w:rPr>
                 <w:color w:val="57534E"/>
                 <w:sz w:val="16"/>
               </w:rPr>
-              <w:t>Ficha de una causa (P4).</w:t>
+              <w:t>Mapa (P5): una zona con necesidad y lo que reportó.</w:t>
             </w:r>
           </w:p>
         </w:tc>
@@ -968,8 +1532,8 @@
             <w:r>
               <w:drawing>
                 <wp:inline xmlns:a="http://schemas.openxmlformats.org/drawingml/2006/main" xmlns:pic="http://schemas.openxmlformats.org/drawingml/2006/picture">
-                  <wp:extent cx="1655946" cy="3583637"/>
-                  <wp:docPr id="7" name="Picture 7"/>
+                  <wp:extent cx="1655946" cy="2943904"/>
+                  <wp:docPr id="15" name="Picture 15"/>
                   <wp:cNvGraphicFramePr>
                     <a:graphicFrameLocks noChangeAspect="1"/>
                   </wp:cNvGraphicFramePr>
@@ -977,11 +1541,11 @@
                     <a:graphicData uri="http://schemas.openxmlformats.org/drawingml/2006/picture">
                       <pic:pic>
                         <pic:nvPicPr>
-                          <pic:cNvPr id="0" name="p04-salida.png"/>
+                          <pic:cNvPr id="0" name="otras-mi-zona.png"/>
                           <pic:cNvPicPr/>
                         </pic:nvPicPr>
                         <pic:blipFill>
-                          <a:blip r:embed="rId33"/>
+                          <a:blip r:embed="rId41"/>
                           <a:stretch>
                             <a:fillRect/>
                           </a:stretch>
@@ -989,7 +1553,7 @@
                         <pic:spPr>
                           <a:xfrm>
                             <a:off x="0" y="0"/>
-                            <a:ext cx="1655946" cy="3583637"/>
+                            <a:ext cx="1655946" cy="2943904"/>
                           </a:xfrm>
                           <a:prstGeom prst="rect"/>
                         </pic:spPr>
@@ -1010,14 +1574,14 @@
                 <w:color w:val="57534E"/>
                 <w:sz w:val="16"/>
               </w:rPr>
-              <w:t xml:space="preserve">Figura 7. </w:t>
+              <w:t xml:space="preserve">Figura 15. </w:t>
             </w:r>
             <w:r>
               <w:rPr>
                 <w:color w:val="57534E"/>
                 <w:sz w:val="16"/>
               </w:rPr>
-              <w:t>Aviso antes de salir al sitio oficial de la entidad.</w:t>
+              <w:t>«Mi zona» del Receptor: lo que está por recibir.</w:t>
             </w:r>
           </w:p>
         </w:tc>
@@ -1054,8 +1618,8 @@
             <w:r>
               <w:drawing>
                 <wp:inline xmlns:a="http://schemas.openxmlformats.org/drawingml/2006/main" xmlns:pic="http://schemas.openxmlformats.org/drawingml/2006/picture">
-                  <wp:extent cx="1655946" cy="3583637"/>
-                  <wp:docPr id="8" name="Picture 8"/>
+                  <wp:extent cx="1655946" cy="2943904"/>
+                  <wp:docPr id="16" name="Picture 16"/>
                   <wp:cNvGraphicFramePr>
                     <a:graphicFrameLocks noChangeAspect="1"/>
                   </wp:cNvGraphicFramePr>
@@ -1063,11 +1627,11 @@
                     <a:graphicData uri="http://schemas.openxmlformats.org/drawingml/2006/picture">
                       <pic:pic>
                         <pic:nvPicPr>
-                          <pic:cNvPr id="0" name="c22-causas.png"/>
+                          <pic:cNvPr id="0" name="otras-voluntariado.png"/>
                           <pic:cNvPicPr/>
                         </pic:nvPicPr>
                         <pic:blipFill>
-                          <a:blip r:embed="rId34"/>
+                          <a:blip r:embed="rId42"/>
                           <a:stretch>
                             <a:fillRect/>
                           </a:stretch>
@@ -1075,7 +1639,7 @@
                         <pic:spPr>
                           <a:xfrm>
                             <a:off x="0" y="0"/>
-                            <a:ext cx="1655946" cy="3583637"/>
+                            <a:ext cx="1655946" cy="2943904"/>
                           </a:xfrm>
                           <a:prstGeom prst="rect"/>
                         </pic:spPr>
@@ -1096,64 +1660,17 @@
                 <w:color w:val="57534E"/>
                 <w:sz w:val="16"/>
               </w:rPr>
-              <w:t xml:space="preserve">Figura 8. </w:t>
+              <w:t xml:space="preserve">Figura 16. </w:t>
             </w:r>
             <w:r>
               <w:rPr>
                 <w:color w:val="57534E"/>
                 <w:sz w:val="16"/>
               </w:rPr>
-              <w:t>Causas en la consola (C22).</w:t>
-            </w:r>
-          </w:p>
-        </w:tc>
-        <w:tc>
-          <w:tcPr>
-            <w:tcW w:type="dxa" w:w="3061"/>
-          </w:tcPr>
-          <w:p/>
-        </w:tc>
-        <w:tc>
-          <w:tcPr>
-            <w:tcW w:type="dxa" w:w="3061"/>
-          </w:tcPr>
-          <w:p/>
-        </w:tc>
-      </w:tr>
-    </w:tbl>
-    <w:p>
-      <w:pPr>
-        <w:spacing w:after="80"/>
-      </w:pPr>
-    </w:p>
-    <w:p>
-      <w:pPr>
-        <w:pStyle w:val="Ttulo2"/>
-      </w:pPr>
-      <w:r>
-        <w:t>1c. Otras pantallas del incremento</w:t>
-      </w:r>
-    </w:p>
-    <w:p>
-      <w:r>
-        <w:t>El incremento tiene más pantallas que las de los dos flujos. Estas también leen la base de la demo del servidor.</w:t>
-      </w:r>
-    </w:p>
-    <w:tbl>
-      <w:tblPr>
-        <w:tblW w:type="auto" w:w="0"/>
-        <w:jc w:val="center"/>
-        <w:tblLook w:firstColumn="1" w:firstRow="1" w:lastColumn="0" w:lastRow="0" w:noHBand="0" w:noVBand="1" w:val="04A0"/>
-      </w:tblPr>
-      <w:tblGrid>
-        <w:gridCol w:w="3061"/>
-        <w:gridCol w:w="3061"/>
-        <w:gridCol w:w="3061"/>
-      </w:tblGrid>
-      <w:tr>
-        <w:trPr>
-          <w:cantSplit w:val="true"/>
-        </w:trPr>
+              <w:t>Voluntariado (P7): jornadas por día con sus cupos reservados.</w:t>
+            </w:r>
+          </w:p>
+        </w:tc>
         <w:tc>
           <w:tcPr>
             <w:tcW w:type="dxa" w:w="3061"/>
@@ -1165,8 +1682,8 @@
             <w:r>
               <w:drawing>
                 <wp:inline xmlns:a="http://schemas.openxmlformats.org/drawingml/2006/main" xmlns:pic="http://schemas.openxmlformats.org/drawingml/2006/picture">
-                  <wp:extent cx="1655946" cy="3583637"/>
-                  <wp:docPr id="9" name="Picture 9"/>
+                  <wp:extent cx="1655946" cy="2943904"/>
+                  <wp:docPr id="17" name="Picture 17"/>
                   <wp:cNvGraphicFramePr>
                     <a:graphicFrameLocks noChangeAspect="1"/>
                   </wp:cNvGraphicFramePr>
@@ -1174,11 +1691,11 @@
                     <a:graphicData uri="http://schemas.openxmlformats.org/drawingml/2006/picture">
                       <pic:pic>
                         <pic:nvPicPr>
-                          <pic:cNvPr id="0" name="p05-mapa.png"/>
+                          <pic:cNvPr id="0" name="otras-reservar.png"/>
                           <pic:cNvPicPr/>
                         </pic:nvPicPr>
                         <pic:blipFill>
-                          <a:blip r:embed="rId35"/>
+                          <a:blip r:embed="rId43"/>
                           <a:stretch>
                             <a:fillRect/>
                           </a:stretch>
@@ -1186,7 +1703,7 @@
                         <pic:spPr>
                           <a:xfrm>
                             <a:off x="0" y="0"/>
-                            <a:ext cx="1655946" cy="3583637"/>
+                            <a:ext cx="1655946" cy="2943904"/>
                           </a:xfrm>
                           <a:prstGeom prst="rect"/>
                         </pic:spPr>
@@ -1207,14 +1724,14 @@
                 <w:color w:val="57534E"/>
                 <w:sz w:val="16"/>
               </w:rPr>
-              <w:t xml:space="preserve">Figura 9. </w:t>
+              <w:t xml:space="preserve">Figura 17. </w:t>
             </w:r>
             <w:r>
               <w:rPr>
                 <w:color w:val="57534E"/>
                 <w:sz w:val="16"/>
               </w:rPr>
-              <w:t>Mapa de acopios (P5): búsqueda por dirección, «Cerca de mí», filtros y mapa.</w:t>
+              <w:t>Reservar un cupo, con el consentimiento de los datos.</w:t>
             </w:r>
           </w:p>
         </w:tc>
@@ -1229,8 +1746,8 @@
             <w:r>
               <w:drawing>
                 <wp:inline xmlns:a="http://schemas.openxmlformats.org/drawingml/2006/main" xmlns:pic="http://schemas.openxmlformats.org/drawingml/2006/picture">
-                  <wp:extent cx="1655946" cy="3583637"/>
-                  <wp:docPr id="10" name="Picture 10"/>
+                  <wp:extent cx="1655946" cy="2943904"/>
+                  <wp:docPr id="18" name="Picture 18"/>
                   <wp:cNvGraphicFramePr>
                     <a:graphicFrameLocks noChangeAspect="1"/>
                   </wp:cNvGraphicFramePr>
@@ -1238,11 +1755,11 @@
                     <a:graphicData uri="http://schemas.openxmlformats.org/drawingml/2006/picture">
                       <pic:pic>
                         <pic:nvPicPr>
-                          <pic:cNvPr id="0" name="p07-voluntariado.png"/>
+                          <pic:cNvPr id="0" name="otras-mi-reserva.png"/>
                           <pic:cNvPicPr/>
                         </pic:nvPicPr>
                         <pic:blipFill>
-                          <a:blip r:embed="rId36"/>
+                          <a:blip r:embed="rId44"/>
                           <a:stretch>
                             <a:fillRect/>
                           </a:stretch>
@@ -1250,7 +1767,7 @@
                         <pic:spPr>
                           <a:xfrm>
                             <a:off x="0" y="0"/>
-                            <a:ext cx="1655946" cy="3583637"/>
+                            <a:ext cx="1655946" cy="2943904"/>
                           </a:xfrm>
                           <a:prstGeom prst="rect"/>
                         </pic:spPr>
@@ -1271,78 +1788,14 @@
                 <w:color w:val="57534E"/>
                 <w:sz w:val="16"/>
               </w:rPr>
-              <w:t xml:space="preserve">Figura 10. </w:t>
+              <w:t xml:space="preserve">Figura 18. </w:t>
             </w:r>
             <w:r>
               <w:rPr>
                 <w:color w:val="57534E"/>
                 <w:sz w:val="16"/>
               </w:rPr>
-              <w:t>Voluntariado (P7): jornadas por día con sus cupos reservados.</w:t>
-            </w:r>
-          </w:p>
-        </w:tc>
-        <w:tc>
-          <w:tcPr>
-            <w:tcW w:type="dxa" w:w="3061"/>
-          </w:tcPr>
-          <w:p>
-            <w:pPr>
-              <w:jc w:val="center"/>
-            </w:pPr>
-            <w:r>
-              <w:drawing>
-                <wp:inline xmlns:a="http://schemas.openxmlformats.org/drawingml/2006/main" xmlns:pic="http://schemas.openxmlformats.org/drawingml/2006/picture">
-                  <wp:extent cx="1655946" cy="3583637"/>
-                  <wp:docPr id="11" name="Picture 11"/>
-                  <wp:cNvGraphicFramePr>
-                    <a:graphicFrameLocks noChangeAspect="1"/>
-                  </wp:cNvGraphicFramePr>
-                  <a:graphic>
-                    <a:graphicData uri="http://schemas.openxmlformats.org/drawingml/2006/picture">
-                      <pic:pic>
-                        <pic:nvPicPr>
-                          <pic:cNvPr id="0" name="c14-turnos.png"/>
-                          <pic:cNvPicPr/>
-                        </pic:nvPicPr>
-                        <pic:blipFill>
-                          <a:blip r:embed="rId37"/>
-                          <a:stretch>
-                            <a:fillRect/>
-                          </a:stretch>
-                        </pic:blipFill>
-                        <pic:spPr>
-                          <a:xfrm>
-                            <a:off x="0" y="0"/>
-                            <a:ext cx="1655946" cy="3583637"/>
-                          </a:xfrm>
-                          <a:prstGeom prst="rect"/>
-                        </pic:spPr>
-                      </pic:pic>
-                    </a:graphicData>
-                  </a:graphic>
-                </wp:inline>
-              </w:drawing>
-            </w:r>
-          </w:p>
-          <w:p>
-            <w:pPr>
-              <w:jc w:val="center"/>
-            </w:pPr>
-            <w:r>
-              <w:rPr>
-                <w:b/>
-                <w:color w:val="57534E"/>
-                <w:sz w:val="16"/>
-              </w:rPr>
-              <w:t xml:space="preserve">Figura 11. </w:t>
-            </w:r>
-            <w:r>
-              <w:rPr>
-                <w:color w:val="57534E"/>
-                <w:sz w:val="16"/>
-              </w:rPr>
-              <w:t>Turnos en la consola (C14): jornadas próximas, en curso y pasadas, de acopios y de entidades.</w:t>
+              <w:t>La reserva (P8): código, jornada y cómo llegar.</w:t>
             </w:r>
           </w:p>
         </w:tc>
@@ -1407,7 +1860,7 @@
         <w:drawing>
           <wp:inline xmlns:a="http://schemas.openxmlformats.org/drawingml/2006/main" xmlns:pic="http://schemas.openxmlformats.org/drawingml/2006/picture">
             <wp:extent cx="8963660" cy="4132596"/>
-            <wp:docPr id="12" name="Picture 12"/>
+            <wp:docPr id="19" name="Picture 19"/>
             <wp:cNvGraphicFramePr>
               <a:graphicFrameLocks noChangeAspect="1"/>
             </wp:cNvGraphicFramePr>
@@ -1419,7 +1872,7 @@
                     <pic:cNvPicPr/>
                   </pic:nvPicPr>
                   <pic:blipFill>
-                    <a:blip r:embed="rId38"/>
+                    <a:blip r:embed="rId45"/>
                     <a:stretch>
                       <a:fillRect/>
                     </a:stretch>
@@ -1448,7 +1901,7 @@
           <w:color w:val="57534E"/>
           <w:sz w:val="18"/>
         </w:rPr>
-        <w:t xml:space="preserve">Figura 12. </w:t>
+        <w:t xml:space="preserve">Figura 19. </w:t>
       </w:r>
       <w:r>
         <w:rPr>
@@ -1468,7 +1921,7 @@
         <w:drawing>
           <wp:inline xmlns:a="http://schemas.openxmlformats.org/drawingml/2006/main" xmlns:pic="http://schemas.openxmlformats.org/drawingml/2006/picture">
             <wp:extent cx="6521442" cy="4896375"/>
-            <wp:docPr id="13" name="Picture 13"/>
+            <wp:docPr id="20" name="Picture 20"/>
             <wp:cNvGraphicFramePr>
               <a:graphicFrameLocks noChangeAspect="1"/>
             </wp:cNvGraphicFramePr>
@@ -1480,7 +1933,7 @@
                     <pic:cNvPicPr/>
                   </pic:nvPicPr>
                   <pic:blipFill>
-                    <a:blip r:embed="rId39"/>
+                    <a:blip r:embed="rId46"/>
                     <a:stretch>
                       <a:fillRect/>
                     </a:stretch>
@@ -1509,7 +1962,7 @@
           <w:color w:val="57534E"/>
           <w:sz w:val="18"/>
         </w:rPr>
-        <w:t xml:space="preserve">Figura 13. </w:t>
+        <w:t xml:space="preserve">Figura 20. </w:t>
       </w:r>
       <w:r>
         <w:rPr>
@@ -1529,7 +1982,7 @@
         <w:drawing>
           <wp:inline xmlns:a="http://schemas.openxmlformats.org/drawingml/2006/main" xmlns:pic="http://schemas.openxmlformats.org/drawingml/2006/picture">
             <wp:extent cx="8963660" cy="4410971"/>
-            <wp:docPr id="14" name="Picture 14"/>
+            <wp:docPr id="21" name="Picture 21"/>
             <wp:cNvGraphicFramePr>
               <a:graphicFrameLocks noChangeAspect="1"/>
             </wp:cNvGraphicFramePr>
@@ -1541,7 +1994,7 @@
                     <pic:cNvPicPr/>
                   </pic:nvPicPr>
                   <pic:blipFill>
-                    <a:blip r:embed="rId40"/>
+                    <a:blip r:embed="rId47"/>
                     <a:stretch>
                       <a:fillRect/>
                     </a:stretch>
@@ -1570,7 +2023,7 @@
           <w:color w:val="57534E"/>
           <w:sz w:val="18"/>
         </w:rPr>
-        <w:t xml:space="preserve">Figura 14. </w:t>
+        <w:t xml:space="preserve">Figura 21. </w:t>
       </w:r>
       <w:r>
         <w:rPr>
@@ -1590,7 +2043,7 @@
         <w:drawing>
           <wp:inline xmlns:a="http://schemas.openxmlformats.org/drawingml/2006/main" xmlns:pic="http://schemas.openxmlformats.org/drawingml/2006/picture">
             <wp:extent cx="3664383" cy="4896374"/>
-            <wp:docPr id="15" name="Picture 15"/>
+            <wp:docPr id="22" name="Picture 22"/>
             <wp:cNvGraphicFramePr>
               <a:graphicFrameLocks noChangeAspect="1"/>
             </wp:cNvGraphicFramePr>
@@ -1602,7 +2055,7 @@
                     <pic:cNvPicPr/>
                   </pic:nvPicPr>
                   <pic:blipFill>
-                    <a:blip r:embed="rId41"/>
+                    <a:blip r:embed="rId48"/>
                     <a:stretch>
                       <a:fillRect/>
                     </a:stretch>
@@ -1631,7 +2084,7 @@
           <w:color w:val="57534E"/>
           <w:sz w:val="18"/>
         </w:rPr>
-        <w:t xml:space="preserve">Figura 15. </w:t>
+        <w:t xml:space="preserve">Figura 22. </w:t>
       </w:r>
       <w:r>
         <w:rPr>

</xml_diff>

<commit_message>
Avance 5: capturas nuevas de Causas y del mapa, y Word regenerado
Seis capturas de Causas y la de la zona, tomadas de nuevo; dos figuras nuevas con las
plataformas y los puntos de RedAcopio. recorridos.md dice de dónde sale cada captura.
Informe de la sesión y fila 2 del plan.

Co-Authored-By: Claude Opus 5.5 <noreply@anthropic.com>
</commit_message>
<xml_diff>
--- a/docs/entregas/Avance 5 - Sprint 2 - Acopio.docx
+++ b/docs/entregas/Avance 5 - Sprint 2 - Acopio.docx
@@ -1362,6 +1362,104 @@
         <w:spacing w:after="80"/>
       </w:pPr>
     </w:p>
+    <w:tbl>
+      <w:tblPr>
+        <w:tblW w:type="auto" w:w="0"/>
+        <w:jc w:val="center"/>
+        <w:tblLook w:firstColumn="1" w:firstRow="1" w:lastColumn="0" w:lastRow="0" w:noHBand="0" w:noVBand="1" w:val="04A0"/>
+      </w:tblPr>
+      <w:tblGrid>
+        <w:gridCol w:w="3061"/>
+        <w:gridCol w:w="3061"/>
+        <w:gridCol w:w="3061"/>
+      </w:tblGrid>
+      <w:tr>
+        <w:trPr>
+          <w:cantSplit w:val="true"/>
+        </w:trPr>
+        <w:tc>
+          <w:tcPr>
+            <w:tcW w:type="dxa" w:w="3061"/>
+          </w:tcPr>
+          <w:p>
+            <w:pPr>
+              <w:jc w:val="center"/>
+            </w:pPr>
+            <w:r>
+              <w:drawing>
+                <wp:inline xmlns:a="http://schemas.openxmlformats.org/drawingml/2006/main" xmlns:pic="http://schemas.openxmlformats.org/drawingml/2006/picture">
+                  <wp:extent cx="1655946" cy="2943904"/>
+                  <wp:docPr id="13" name="Picture 13"/>
+                  <wp:cNvGraphicFramePr>
+                    <a:graphicFrameLocks noChangeAspect="1"/>
+                  </wp:cNvGraphicFramePr>
+                  <a:graphic>
+                    <a:graphicData uri="http://schemas.openxmlformats.org/drawingml/2006/picture">
+                      <pic:pic>
+                        <pic:nvPicPr>
+                          <pic:cNvPr id="0" name="causas-7-plataformas.png"/>
+                          <pic:cNvPicPr/>
+                        </pic:nvPicPr>
+                        <pic:blipFill>
+                          <a:blip r:embed="rId39"/>
+                          <a:stretch>
+                            <a:fillRect/>
+                          </a:stretch>
+                        </pic:blipFill>
+                        <pic:spPr>
+                          <a:xfrm>
+                            <a:off x="0" y="0"/>
+                            <a:ext cx="1655946" cy="2943904"/>
+                          </a:xfrm>
+                          <a:prstGeom prst="rect"/>
+                        </pic:spPr>
+                      </pic:pic>
+                    </a:graphicData>
+                  </a:graphic>
+                </wp:inline>
+              </w:drawing>
+            </w:r>
+          </w:p>
+          <w:p>
+            <w:pPr>
+              <w:jc w:val="center"/>
+            </w:pPr>
+            <w:r>
+              <w:rPr>
+                <w:b/>
+                <w:color w:val="57534E"/>
+                <w:sz w:val="16"/>
+              </w:rPr>
+              <w:t xml:space="preserve">Figura 13. </w:t>
+            </w:r>
+            <w:r>
+              <w:rPr>
+                <w:color w:val="57534E"/>
+                <w:sz w:val="16"/>
+              </w:rPr>
+              <w:t>Al final de Causas, otras plataformas que ayudan, con la foto de su sitio. Acopio no las verifica.</w:t>
+            </w:r>
+          </w:p>
+        </w:tc>
+        <w:tc>
+          <w:tcPr>
+            <w:tcW w:type="dxa" w:w="3061"/>
+          </w:tcPr>
+          <w:p/>
+        </w:tc>
+        <w:tc>
+          <w:tcPr>
+            <w:tcW w:type="dxa" w:w="3061"/>
+          </w:tcPr>
+          <w:p/>
+        </w:tc>
+      </w:tr>
+    </w:tbl>
+    <w:p>
+      <w:pPr>
+        <w:spacing w:after="80"/>
+      </w:pPr>
+    </w:p>
     <w:p>
       <w:pPr>
         <w:pStyle w:val="Ttulo2"/>
@@ -1405,7 +1503,7 @@
               <w:drawing>
                 <wp:inline xmlns:a="http://schemas.openxmlformats.org/drawingml/2006/main" xmlns:pic="http://schemas.openxmlformats.org/drawingml/2006/picture">
                   <wp:extent cx="1655946" cy="3583637"/>
-                  <wp:docPr id="13" name="Picture 13"/>
+                  <wp:docPr id="14" name="Picture 14"/>
                   <wp:cNvGraphicFramePr>
                     <a:graphicFrameLocks noChangeAspect="1"/>
                   </wp:cNvGraphicFramePr>
@@ -1417,7 +1515,7 @@
                           <pic:cNvPicPr/>
                         </pic:nvPicPr>
                         <pic:blipFill>
-                          <a:blip r:embed="rId39"/>
+                          <a:blip r:embed="rId40"/>
                           <a:stretch>
                             <a:fillRect/>
                           </a:stretch>
@@ -1446,7 +1544,7 @@
                 <w:color w:val="57534E"/>
                 <w:sz w:val="16"/>
               </w:rPr>
-              <w:t xml:space="preserve">Figura 13. </w:t>
+              <w:t xml:space="preserve">Figura 14. </w:t>
             </w:r>
             <w:r>
               <w:rPr>
@@ -1454,70 +1552,6 @@
                 <w:sz w:val="16"/>
               </w:rPr>
               <w:t>Portada (P1): el balance dice qué hace falta y qué no traer.</w:t>
-            </w:r>
-          </w:p>
-        </w:tc>
-        <w:tc>
-          <w:tcPr>
-            <w:tcW w:type="dxa" w:w="3061"/>
-          </w:tcPr>
-          <w:p>
-            <w:pPr>
-              <w:jc w:val="center"/>
-            </w:pPr>
-            <w:r>
-              <w:drawing>
-                <wp:inline xmlns:a="http://schemas.openxmlformats.org/drawingml/2006/main" xmlns:pic="http://schemas.openxmlformats.org/drawingml/2006/picture">
-                  <wp:extent cx="1655946" cy="2943904"/>
-                  <wp:docPr id="14" name="Picture 14"/>
-                  <wp:cNvGraphicFramePr>
-                    <a:graphicFrameLocks noChangeAspect="1"/>
-                  </wp:cNvGraphicFramePr>
-                  <a:graphic>
-                    <a:graphicData uri="http://schemas.openxmlformats.org/drawingml/2006/picture">
-                      <pic:pic>
-                        <pic:nvPicPr>
-                          <pic:cNvPr id="0" name="otras-mapa-zona.png"/>
-                          <pic:cNvPicPr/>
-                        </pic:nvPicPr>
-                        <pic:blipFill>
-                          <a:blip r:embed="rId40"/>
-                          <a:stretch>
-                            <a:fillRect/>
-                          </a:stretch>
-                        </pic:blipFill>
-                        <pic:spPr>
-                          <a:xfrm>
-                            <a:off x="0" y="0"/>
-                            <a:ext cx="1655946" cy="2943904"/>
-                          </a:xfrm>
-                          <a:prstGeom prst="rect"/>
-                        </pic:spPr>
-                      </pic:pic>
-                    </a:graphicData>
-                  </a:graphic>
-                </wp:inline>
-              </w:drawing>
-            </w:r>
-          </w:p>
-          <w:p>
-            <w:pPr>
-              <w:jc w:val="center"/>
-            </w:pPr>
-            <w:r>
-              <w:rPr>
-                <w:b/>
-                <w:color w:val="57534E"/>
-                <w:sz w:val="16"/>
-              </w:rPr>
-              <w:t xml:space="preserve">Figura 14. </w:t>
-            </w:r>
-            <w:r>
-              <w:rPr>
-                <w:color w:val="57534E"/>
-                <w:sz w:val="16"/>
-              </w:rPr>
-              <w:t>Mapa (P5): una zona con necesidad y lo que reportó.</w:t>
             </w:r>
           </w:p>
         </w:tc>
@@ -1541,7 +1575,7 @@
                     <a:graphicData uri="http://schemas.openxmlformats.org/drawingml/2006/picture">
                       <pic:pic>
                         <pic:nvPicPr>
-                          <pic:cNvPr id="0" name="otras-mi-zona.png"/>
+                          <pic:cNvPr id="0" name="otras-mapa-puntos.png"/>
                           <pic:cNvPicPr/>
                         </pic:nvPicPr>
                         <pic:blipFill>
@@ -1581,32 +1615,10 @@
                 <w:color w:val="57534E"/>
                 <w:sz w:val="16"/>
               </w:rPr>
-              <w:t>«Mi zona» del Receptor: lo que está por recibir.</w:t>
-            </w:r>
-          </w:p>
-        </w:tc>
-      </w:tr>
-    </w:tbl>
-    <w:p>
-      <w:pPr>
-        <w:spacing w:after="80"/>
-      </w:pPr>
-    </w:p>
-    <w:tbl>
-      <w:tblPr>
-        <w:tblW w:type="auto" w:w="0"/>
-        <w:jc w:val="center"/>
-        <w:tblLook w:firstColumn="1" w:firstRow="1" w:lastColumn="0" w:lastRow="0" w:noHBand="0" w:noVBand="1" w:val="04A0"/>
-      </w:tblPr>
-      <w:tblGrid>
-        <w:gridCol w:w="3061"/>
-        <w:gridCol w:w="3061"/>
-        <w:gridCol w:w="3061"/>
-      </w:tblGrid>
-      <w:tr>
-        <w:trPr>
-          <w:cantSplit w:val="true"/>
-        </w:trPr>
+              <w:t>Mapa (P5): los acopios en verde y los puntos de RedAcopio en blanco, agrupados por tipo.</w:t>
+            </w:r>
+          </w:p>
+        </w:tc>
         <w:tc>
           <w:tcPr>
             <w:tcW w:type="dxa" w:w="3061"/>
@@ -1627,7 +1639,7 @@
                     <a:graphicData uri="http://schemas.openxmlformats.org/drawingml/2006/picture">
                       <pic:pic>
                         <pic:nvPicPr>
-                          <pic:cNvPr id="0" name="otras-voluntariado.png"/>
+                          <pic:cNvPr id="0" name="otras-mapa-zona.png"/>
                           <pic:cNvPicPr/>
                         </pic:nvPicPr>
                         <pic:blipFill>
@@ -1667,10 +1679,32 @@
                 <w:color w:val="57534E"/>
                 <w:sz w:val="16"/>
               </w:rPr>
-              <w:t>Voluntariado (P7): jornadas por día con sus cupos reservados.</w:t>
-            </w:r>
-          </w:p>
-        </w:tc>
+              <w:t>Mapa (P5): una zona con necesidad y lo que reportó.</w:t>
+            </w:r>
+          </w:p>
+        </w:tc>
+      </w:tr>
+    </w:tbl>
+    <w:p>
+      <w:pPr>
+        <w:spacing w:after="80"/>
+      </w:pPr>
+    </w:p>
+    <w:tbl>
+      <w:tblPr>
+        <w:tblW w:type="auto" w:w="0"/>
+        <w:jc w:val="center"/>
+        <w:tblLook w:firstColumn="1" w:firstRow="1" w:lastColumn="0" w:lastRow="0" w:noHBand="0" w:noVBand="1" w:val="04A0"/>
+      </w:tblPr>
+      <w:tblGrid>
+        <w:gridCol w:w="3061"/>
+        <w:gridCol w:w="3061"/>
+        <w:gridCol w:w="3061"/>
+      </w:tblGrid>
+      <w:tr>
+        <w:trPr>
+          <w:cantSplit w:val="true"/>
+        </w:trPr>
         <w:tc>
           <w:tcPr>
             <w:tcW w:type="dxa" w:w="3061"/>
@@ -1691,7 +1725,7 @@
                     <a:graphicData uri="http://schemas.openxmlformats.org/drawingml/2006/picture">
                       <pic:pic>
                         <pic:nvPicPr>
-                          <pic:cNvPr id="0" name="otras-reservar.png"/>
+                          <pic:cNvPr id="0" name="otras-mi-zona.png"/>
                           <pic:cNvPicPr/>
                         </pic:nvPicPr>
                         <pic:blipFill>
@@ -1731,7 +1765,7 @@
                 <w:color w:val="57534E"/>
                 <w:sz w:val="16"/>
               </w:rPr>
-              <w:t>Reservar un cupo, con el consentimiento de los datos.</w:t>
+              <w:t>«Mi zona» del Receptor: lo que está por recibir.</w:t>
             </w:r>
           </w:p>
         </w:tc>
@@ -1755,7 +1789,7 @@
                     <a:graphicData uri="http://schemas.openxmlformats.org/drawingml/2006/picture">
                       <pic:pic>
                         <pic:nvPicPr>
-                          <pic:cNvPr id="0" name="otras-mi-reserva.png"/>
+                          <pic:cNvPr id="0" name="otras-voluntariado.png"/>
                           <pic:cNvPicPr/>
                         </pic:nvPicPr>
                         <pic:blipFill>
@@ -1795,9 +1829,171 @@
                 <w:color w:val="57534E"/>
                 <w:sz w:val="16"/>
               </w:rPr>
+              <w:t>Voluntariado (P7): jornadas por día con sus cupos reservados.</w:t>
+            </w:r>
+          </w:p>
+        </w:tc>
+        <w:tc>
+          <w:tcPr>
+            <w:tcW w:type="dxa" w:w="3061"/>
+          </w:tcPr>
+          <w:p>
+            <w:pPr>
+              <w:jc w:val="center"/>
+            </w:pPr>
+            <w:r>
+              <w:drawing>
+                <wp:inline xmlns:a="http://schemas.openxmlformats.org/drawingml/2006/main" xmlns:pic="http://schemas.openxmlformats.org/drawingml/2006/picture">
+                  <wp:extent cx="1655946" cy="2943904"/>
+                  <wp:docPr id="19" name="Picture 19"/>
+                  <wp:cNvGraphicFramePr>
+                    <a:graphicFrameLocks noChangeAspect="1"/>
+                  </wp:cNvGraphicFramePr>
+                  <a:graphic>
+                    <a:graphicData uri="http://schemas.openxmlformats.org/drawingml/2006/picture">
+                      <pic:pic>
+                        <pic:nvPicPr>
+                          <pic:cNvPr id="0" name="otras-reservar.png"/>
+                          <pic:cNvPicPr/>
+                        </pic:nvPicPr>
+                        <pic:blipFill>
+                          <a:blip r:embed="rId45"/>
+                          <a:stretch>
+                            <a:fillRect/>
+                          </a:stretch>
+                        </pic:blipFill>
+                        <pic:spPr>
+                          <a:xfrm>
+                            <a:off x="0" y="0"/>
+                            <a:ext cx="1655946" cy="2943904"/>
+                          </a:xfrm>
+                          <a:prstGeom prst="rect"/>
+                        </pic:spPr>
+                      </pic:pic>
+                    </a:graphicData>
+                  </a:graphic>
+                </wp:inline>
+              </w:drawing>
+            </w:r>
+          </w:p>
+          <w:p>
+            <w:pPr>
+              <w:jc w:val="center"/>
+            </w:pPr>
+            <w:r>
+              <w:rPr>
+                <w:b/>
+                <w:color w:val="57534E"/>
+                <w:sz w:val="16"/>
+              </w:rPr>
+              <w:t xml:space="preserve">Figura 19. </w:t>
+            </w:r>
+            <w:r>
+              <w:rPr>
+                <w:color w:val="57534E"/>
+                <w:sz w:val="16"/>
+              </w:rPr>
+              <w:t>Reservar un cupo, con el consentimiento de los datos.</w:t>
+            </w:r>
+          </w:p>
+        </w:tc>
+      </w:tr>
+    </w:tbl>
+    <w:p>
+      <w:pPr>
+        <w:spacing w:after="80"/>
+      </w:pPr>
+    </w:p>
+    <w:tbl>
+      <w:tblPr>
+        <w:tblW w:type="auto" w:w="0"/>
+        <w:jc w:val="center"/>
+        <w:tblLook w:firstColumn="1" w:firstRow="1" w:lastColumn="0" w:lastRow="0" w:noHBand="0" w:noVBand="1" w:val="04A0"/>
+      </w:tblPr>
+      <w:tblGrid>
+        <w:gridCol w:w="3061"/>
+        <w:gridCol w:w="3061"/>
+        <w:gridCol w:w="3061"/>
+      </w:tblGrid>
+      <w:tr>
+        <w:trPr>
+          <w:cantSplit w:val="true"/>
+        </w:trPr>
+        <w:tc>
+          <w:tcPr>
+            <w:tcW w:type="dxa" w:w="3061"/>
+          </w:tcPr>
+          <w:p>
+            <w:pPr>
+              <w:jc w:val="center"/>
+            </w:pPr>
+            <w:r>
+              <w:drawing>
+                <wp:inline xmlns:a="http://schemas.openxmlformats.org/drawingml/2006/main" xmlns:pic="http://schemas.openxmlformats.org/drawingml/2006/picture">
+                  <wp:extent cx="1655946" cy="2943904"/>
+                  <wp:docPr id="20" name="Picture 20"/>
+                  <wp:cNvGraphicFramePr>
+                    <a:graphicFrameLocks noChangeAspect="1"/>
+                  </wp:cNvGraphicFramePr>
+                  <a:graphic>
+                    <a:graphicData uri="http://schemas.openxmlformats.org/drawingml/2006/picture">
+                      <pic:pic>
+                        <pic:nvPicPr>
+                          <pic:cNvPr id="0" name="otras-mi-reserva.png"/>
+                          <pic:cNvPicPr/>
+                        </pic:nvPicPr>
+                        <pic:blipFill>
+                          <a:blip r:embed="rId46"/>
+                          <a:stretch>
+                            <a:fillRect/>
+                          </a:stretch>
+                        </pic:blipFill>
+                        <pic:spPr>
+                          <a:xfrm>
+                            <a:off x="0" y="0"/>
+                            <a:ext cx="1655946" cy="2943904"/>
+                          </a:xfrm>
+                          <a:prstGeom prst="rect"/>
+                        </pic:spPr>
+                      </pic:pic>
+                    </a:graphicData>
+                  </a:graphic>
+                </wp:inline>
+              </w:drawing>
+            </w:r>
+          </w:p>
+          <w:p>
+            <w:pPr>
+              <w:jc w:val="center"/>
+            </w:pPr>
+            <w:r>
+              <w:rPr>
+                <w:b/>
+                <w:color w:val="57534E"/>
+                <w:sz w:val="16"/>
+              </w:rPr>
+              <w:t xml:space="preserve">Figura 20. </w:t>
+            </w:r>
+            <w:r>
+              <w:rPr>
+                <w:color w:val="57534E"/>
+                <w:sz w:val="16"/>
+              </w:rPr>
               <w:t>La reserva (P8): código, jornada y cómo llegar.</w:t>
             </w:r>
           </w:p>
+        </w:tc>
+        <w:tc>
+          <w:tcPr>
+            <w:tcW w:type="dxa" w:w="3061"/>
+          </w:tcPr>
+          <w:p/>
+        </w:tc>
+        <w:tc>
+          <w:tcPr>
+            <w:tcW w:type="dxa" w:w="3061"/>
+          </w:tcPr>
+          <w:p/>
         </w:tc>
       </w:tr>
     </w:tbl>
@@ -1827,7 +2023,7 @@
     </w:p>
     <w:p>
       <w:r>
-        <w:t xml:space="preserve">Los diagramas están al día con el código del 18 de octubre. El de paquetes es el que pide la sustentación; se dibuja a mano en </w:t>
+        <w:t xml:space="preserve">Los diagramas están al día con el código del 19 de octubre. El de paquetes es el que pide la sustentación; se dibuja a mano en </w:t>
       </w:r>
       <w:r>
         <w:rPr>
@@ -1860,7 +2056,7 @@
         <w:drawing>
           <wp:inline xmlns:a="http://schemas.openxmlformats.org/drawingml/2006/main" xmlns:pic="http://schemas.openxmlformats.org/drawingml/2006/picture">
             <wp:extent cx="8963660" cy="4132596"/>
-            <wp:docPr id="19" name="Picture 19"/>
+            <wp:docPr id="21" name="Picture 21"/>
             <wp:cNvGraphicFramePr>
               <a:graphicFrameLocks noChangeAspect="1"/>
             </wp:cNvGraphicFramePr>
@@ -1872,7 +2068,7 @@
                     <pic:cNvPicPr/>
                   </pic:nvPicPr>
                   <pic:blipFill>
-                    <a:blip r:embed="rId45"/>
+                    <a:blip r:embed="rId47"/>
                     <a:stretch>
                       <a:fillRect/>
                     </a:stretch>
@@ -1901,7 +2097,7 @@
           <w:color w:val="57534E"/>
           <w:sz w:val="18"/>
         </w:rPr>
-        <w:t xml:space="preserve">Figura 19. </w:t>
+        <w:t xml:space="preserve">Figura 21. </w:t>
       </w:r>
       <w:r>
         <w:rPr>
@@ -1920,8 +2116,8 @@
       <w:r>
         <w:drawing>
           <wp:inline xmlns:a="http://schemas.openxmlformats.org/drawingml/2006/main" xmlns:pic="http://schemas.openxmlformats.org/drawingml/2006/picture">
-            <wp:extent cx="6521442" cy="4896375"/>
-            <wp:docPr id="20" name="Picture 20"/>
+            <wp:extent cx="5338348" cy="4896374"/>
+            <wp:docPr id="22" name="Picture 22"/>
             <wp:cNvGraphicFramePr>
               <a:graphicFrameLocks noChangeAspect="1"/>
             </wp:cNvGraphicFramePr>
@@ -1933,7 +2129,7 @@
                     <pic:cNvPicPr/>
                   </pic:nvPicPr>
                   <pic:blipFill>
-                    <a:blip r:embed="rId46"/>
+                    <a:blip r:embed="rId48"/>
                     <a:stretch>
                       <a:fillRect/>
                     </a:stretch>
@@ -1941,7 +2137,7 @@
                   <pic:spPr>
                     <a:xfrm>
                       <a:off x="0" y="0"/>
-                      <a:ext cx="6521442" cy="4896375"/>
+                      <a:ext cx="5338348" cy="4896374"/>
                     </a:xfrm>
                     <a:prstGeom prst="rect"/>
                   </pic:spPr>
@@ -1962,14 +2158,14 @@
           <w:color w:val="57534E"/>
           <w:sz w:val="18"/>
         </w:rPr>
-        <w:t xml:space="preserve">Figura 20. </w:t>
+        <w:t xml:space="preserve">Figura 22. </w:t>
       </w:r>
       <w:r>
         <w:rPr>
           <w:color w:val="57534E"/>
           <w:sz w:val="18"/>
         </w:rPr>
-        <w:t>Paquetes de la API: los módulos de dominio arriba, los transversales abajo. Incluye turnos.</w:t>
+        <w:t>Paquetes de la API: los módulos de dominio arriba, los transversales abajo. Incluye turnos e importacion.</w:t>
       </w:r>
     </w:p>
     <w:p>
@@ -1982,7 +2178,7 @@
         <w:drawing>
           <wp:inline xmlns:a="http://schemas.openxmlformats.org/drawingml/2006/main" xmlns:pic="http://schemas.openxmlformats.org/drawingml/2006/picture">
             <wp:extent cx="8963660" cy="4410971"/>
-            <wp:docPr id="21" name="Picture 21"/>
+            <wp:docPr id="23" name="Picture 23"/>
             <wp:cNvGraphicFramePr>
               <a:graphicFrameLocks noChangeAspect="1"/>
             </wp:cNvGraphicFramePr>
@@ -1994,7 +2190,7 @@
                     <pic:cNvPicPr/>
                   </pic:nvPicPr>
                   <pic:blipFill>
-                    <a:blip r:embed="rId47"/>
+                    <a:blip r:embed="rId49"/>
                     <a:stretch>
                       <a:fillRect/>
                     </a:stretch>
@@ -2023,7 +2219,7 @@
           <w:color w:val="57534E"/>
           <w:sz w:val="18"/>
         </w:rPr>
-        <w:t xml:space="preserve">Figura 21. </w:t>
+        <w:t xml:space="preserve">Figura 23. </w:t>
       </w:r>
       <w:r>
         <w:rPr>
@@ -2043,7 +2239,7 @@
         <w:drawing>
           <wp:inline xmlns:a="http://schemas.openxmlformats.org/drawingml/2006/main" xmlns:pic="http://schemas.openxmlformats.org/drawingml/2006/picture">
             <wp:extent cx="3664383" cy="4896374"/>
-            <wp:docPr id="22" name="Picture 22"/>
+            <wp:docPr id="24" name="Picture 24"/>
             <wp:cNvGraphicFramePr>
               <a:graphicFrameLocks noChangeAspect="1"/>
             </wp:cNvGraphicFramePr>
@@ -2055,7 +2251,7 @@
                     <pic:cNvPicPr/>
                   </pic:nvPicPr>
                   <pic:blipFill>
-                    <a:blip r:embed="rId48"/>
+                    <a:blip r:embed="rId50"/>
                     <a:stretch>
                       <a:fillRect/>
                     </a:stretch>
@@ -2084,7 +2280,7 @@
           <w:color w:val="57534E"/>
           <w:sz w:val="18"/>
         </w:rPr>
-        <w:t xml:space="preserve">Figura 22. </w:t>
+        <w:t xml:space="preserve">Figura 24. </w:t>
       </w:r>
       <w:r>
         <w:rPr>

</xml_diff>

<commit_message>
Avance 5: capturas del tablero y del seguimiento, y Word regenerado
Co-Authored-By: Claude Opus 5.5 <noreply@anthropic.com>
</commit_message>
<xml_diff>
--- a/docs/entregas/Avance 5 - Sprint 2 - Acopio.docx
+++ b/docs/entregas/Avance 5 - Sprint 2 - Acopio.docx
@@ -5707,41 +5707,66 @@
         <w:t>).</w:t>
       </w:r>
     </w:p>
-    <w:tbl>
-      <w:tblPr>
-        <w:tblStyle w:val="Tablaconcuadrcula"/>
-        <w:tblW w:type="auto" w:w="0"/>
+    <w:p>
+      <w:pPr>
+        <w:keepNext/>
+        <w:spacing w:after="40"/>
         <w:jc w:val="center"/>
-        <w:tblLook w:firstColumn="1" w:firstRow="1" w:lastColumn="0" w:lastRow="0" w:noHBand="0" w:noVBand="1" w:val="04A0"/>
-      </w:tblPr>
-      <w:tblGrid>
-        <w:gridCol w:w="9184"/>
-      </w:tblGrid>
-      <w:tr>
-        <w:tc>
-          <w:tcPr>
-            <w:tcW w:type="dxa" w:w="9184"/>
-            <w:shd w:val="clear" w:color="auto" w:fill="FFF4E5"/>
-          </w:tcPr>
-          <w:p>
-            <w:pPr>
-              <w:jc w:val="center"/>
-            </w:pPr>
-            <w:r>
-              <w:rPr>
-                <w:b/>
-                <w:sz w:val="18"/>
-              </w:rPr>
-              <w:t>Pendiente: captura del tablero del Project con las historias del Sprint 2 (evidencia/avance-05/tablero.png).</w:t>
-            </w:r>
-          </w:p>
-        </w:tc>
-      </w:tr>
-    </w:tbl>
+      </w:pPr>
+      <w:r>
+        <w:drawing>
+          <wp:inline xmlns:a="http://schemas.openxmlformats.org/drawingml/2006/main" xmlns:pic="http://schemas.openxmlformats.org/drawingml/2006/picture">
+            <wp:extent cx="5831840" cy="2700559"/>
+            <wp:docPr id="25" name="Picture 25"/>
+            <wp:cNvGraphicFramePr>
+              <a:graphicFrameLocks noChangeAspect="1"/>
+            </wp:cNvGraphicFramePr>
+            <a:graphic>
+              <a:graphicData uri="http://schemas.openxmlformats.org/drawingml/2006/picture">
+                <pic:pic>
+                  <pic:nvPicPr>
+                    <pic:cNvPr id="0" name="tablero.png"/>
+                    <pic:cNvPicPr/>
+                  </pic:nvPicPr>
+                  <pic:blipFill>
+                    <a:blip r:embed="rId51"/>
+                    <a:stretch>
+                      <a:fillRect/>
+                    </a:stretch>
+                  </pic:blipFill>
+                  <pic:spPr>
+                    <a:xfrm>
+                      <a:off x="0" y="0"/>
+                      <a:ext cx="5831840" cy="2700559"/>
+                    </a:xfrm>
+                    <a:prstGeom prst="rect"/>
+                  </pic:spPr>
+                </pic:pic>
+              </a:graphicData>
+            </a:graphic>
+          </wp:inline>
+        </w:drawing>
+      </w:r>
+    </w:p>
     <w:p>
       <w:pPr>
-        <w:spacing w:after="40"/>
-      </w:pPr>
+        <w:jc w:val="center"/>
+      </w:pPr>
+      <w:r>
+        <w:rPr>
+          <w:b/>
+          <w:color w:val="57534E"/>
+          <w:sz w:val="18"/>
+        </w:rPr>
+        <w:t xml:space="preserve">Figura 25. </w:t>
+      </w:r>
+      <w:r>
+        <w:rPr>
+          <w:color w:val="57534E"/>
+          <w:sz w:val="18"/>
+        </w:rPr>
+        <w:t>Tablero del Project con las historias seleccionadas para el Sprint 2.</w:t>
+      </w:r>
     </w:p>
     <w:p>
       <w:pPr>
@@ -6117,41 +6142,66 @@
         <w:spacing w:after="40"/>
       </w:pPr>
     </w:p>
-    <w:tbl>
-      <w:tblPr>
-        <w:tblStyle w:val="Tablaconcuadrcula"/>
-        <w:tblW w:type="auto" w:w="0"/>
+    <w:p>
+      <w:pPr>
+        <w:keepNext/>
+        <w:spacing w:after="40"/>
         <w:jc w:val="center"/>
-        <w:tblLook w:firstColumn="1" w:firstRow="1" w:lastColumn="0" w:lastRow="0" w:noHBand="0" w:noVBand="1" w:val="04A0"/>
-      </w:tblPr>
-      <w:tblGrid>
-        <w:gridCol w:w="9184"/>
-      </w:tblGrid>
-      <w:tr>
-        <w:tc>
-          <w:tcPr>
-            <w:tcW w:type="dxa" w:w="9184"/>
-            <w:shd w:val="clear" w:color="auto" w:fill="FFF4E5"/>
-          </w:tcPr>
-          <w:p>
-            <w:pPr>
-              <w:jc w:val="center"/>
-            </w:pPr>
-            <w:r>
-              <w:rPr>
-                <w:b/>
-                <w:sz w:val="18"/>
-              </w:rPr>
-              <w:t>Pendiente: captura del seguimiento (evidencia/avance-05/seguimiento.png).</w:t>
-            </w:r>
-          </w:p>
-        </w:tc>
-      </w:tr>
-    </w:tbl>
+      </w:pPr>
+      <w:r>
+        <w:drawing>
+          <wp:inline xmlns:a="http://schemas.openxmlformats.org/drawingml/2006/main" xmlns:pic="http://schemas.openxmlformats.org/drawingml/2006/picture">
+            <wp:extent cx="5831840" cy="2714233"/>
+            <wp:docPr id="26" name="Picture 26"/>
+            <wp:cNvGraphicFramePr>
+              <a:graphicFrameLocks noChangeAspect="1"/>
+            </wp:cNvGraphicFramePr>
+            <a:graphic>
+              <a:graphicData uri="http://schemas.openxmlformats.org/drawingml/2006/picture">
+                <pic:pic>
+                  <pic:nvPicPr>
+                    <pic:cNvPr id="0" name="seguimiento.png"/>
+                    <pic:cNvPicPr/>
+                  </pic:nvPicPr>
+                  <pic:blipFill>
+                    <a:blip r:embed="rId52"/>
+                    <a:stretch>
+                      <a:fillRect/>
+                    </a:stretch>
+                  </pic:blipFill>
+                  <pic:spPr>
+                    <a:xfrm>
+                      <a:off x="0" y="0"/>
+                      <a:ext cx="5831840" cy="2714233"/>
+                    </a:xfrm>
+                    <a:prstGeom prst="rect"/>
+                  </pic:spPr>
+                </pic:pic>
+              </a:graphicData>
+            </a:graphic>
+          </wp:inline>
+        </w:drawing>
+      </w:r>
+    </w:p>
     <w:p>
       <w:pPr>
-        <w:spacing w:after="40"/>
-      </w:pPr>
+        <w:jc w:val="center"/>
+      </w:pPr>
+      <w:r>
+        <w:rPr>
+          <w:b/>
+          <w:color w:val="57534E"/>
+          <w:sz w:val="18"/>
+        </w:rPr>
+        <w:t xml:space="preserve">Figura 26. </w:t>
+      </w:r>
+      <w:r>
+        <w:rPr>
+          <w:color w:val="57534E"/>
+          <w:sz w:val="18"/>
+        </w:rPr>
+        <w:t>Seguimiento del Sprint 2.</w:t>
+      </w:r>
     </w:p>
     <w:p>
       <w:pPr>

</xml_diff>